<commit_message>
Shorten Project 1 report and reserve later weeks for client testing and maintenance
</commit_message>
<xml_diff>
--- a/docs/internship-report/GD008_Complete_Project_1_Report_Chinese_Draft.docx
+++ b/docs/internship-report/GD008_Complete_Project_1_Report_Chinese_Draft.docx
@@ -1005,7 +1005,7 @@
         <w:jc w:val="both"/>
       </w:pPr>
       <w:r>
-        <w:t>本报告介绍 Bakti Makmur (M) Sdn. Bhd. 软件工程实习中的第一个项目：二维码库存管理网站。实习计划期间为 2026 年 10 月 12 日至 2027 年 1 月 9 日；第一个项目暂按 10 月 12 日至 11 月 7 日约四周安排。本稿涵盖需求分析、技术研究、工作流程、数据设计、专业实践及后续计划。工人拟扫描商品二维码进入表单，填写员工 ID、数量并附照片；管理员负责库存、商品、记录更正、标签和补货提醒。方案使用 HTML、CSS、JavaScript、Google Apps Script、Google Sheets 和 Google Drive。本稿截至 10 月 21 日，未来工作及测试结果未作为已完成事实，正式实习报告仍须补入实际证据与后续项目。</w:t>
+        <w:t>本阶段报告记录实习中的第一个项目——二维码库存管理网站。前两周集中于客户需求、技术研究、流程设计和初步原型，第三周安排客户检视及试运行，第四周按反馈进行复测与维护。具体修改待客户确认。本稿不将未来安排写为已完成成果。</w:t>
       </w:r>
     </w:p>
     <w:p>
@@ -1074,7 +1074,7 @@
         <w:jc w:val="both"/>
       </w:pPr>
       <w:r>
-        <w:t>表 A3：功能测试计划</w:t>
+        <w:t>表 A3：试运行检查清单</w:t>
       </w:r>
     </w:p>
     <w:p>
@@ -1084,24 +1084,6 @@
       </w:pPr>
       <w:r>
         <w:t>附录 A：需求、计划及测试案例</w:t>
-      </w:r>
-    </w:p>
-    <w:p>
-      <w:pPr>
-        <w:widowControl/>
-        <w:jc w:val="both"/>
-      </w:pPr>
-      <w:r>
-        <w:t>附录 B：部署与使用说明</w:t>
-      </w:r>
-    </w:p>
-    <w:p>
-      <w:pPr>
-        <w:widowControl/>
-        <w:jc w:val="both"/>
-      </w:pPr>
-      <w:r>
-        <w:t>附录 C：证据与待确认资料</w:t>
       </w:r>
     </w:p>
     <w:p>
@@ -1128,7 +1110,7 @@
         <w:pStyle w:val="Heading2"/>
       </w:pPr>
       <w:r>
-        <w:t>1.1 公司与实习背景</w:t>
+        <w:t>1.1 实习与项目背景</w:t>
       </w:r>
     </w:p>
     <w:p>
@@ -1137,7 +1119,7 @@
         <w:jc w:val="both"/>
       </w:pPr>
       <w:r>
-        <w:t>根据实习计划，实习单位为 Bakti Makmur (M) Sdn. Bhd.，专业为软件工程，实习期为 2026 年 10 月 12 日至 2027 年 1 月 9 日。计划中列明的企业主管为 Christopher Kong San Hor，职位为 IT Technician。本报告集中描述第一个项目：基于二维码的库存管理网站。</w:t>
+        <w:t>实习单位为 Bakti Makmur (M) Sdn. Bhd.，实习期为 2026 年 10 月 12 日至 2027 年 1 月 9 日，企业主管为 Christopher Kong San Hor，职位 IT Technician。本部分介绍第一个项目——二维码库存管理网站，暂定安排为 2026 年 10 月 12 日至 11 月 7 日。公司背景资料及 Logo 之后补充。</w:t>
       </w:r>
     </w:p>
     <w:p>
@@ -1147,7 +1129,7 @@
         <w:jc w:val="both"/>
       </w:pPr>
       <w:r>
-        <w:t>本项目涉及进货、领货及相关商品资料与照片的管理。客户提供了库存电子表格、Google Form 链接，以及包含个别商品二维码与照片的 PDF，作为需求讨论的基础。公司完整地址、主要业务及正式组织架构尚未提供，定稿前需要补充核实。</w:t>
+        <w:t>客户原本使用商品二维码连接 Google Form。项目将领货、进货、员工 ID 与照片凭证整合到手机友好的网站，并由管理员查看库存数量及执行管理操作。</w:t>
       </w:r>
     </w:p>
     <w:p>
@@ -1155,7 +1137,7 @@
         <w:pStyle w:val="Heading2"/>
       </w:pPr>
       <w:r>
-        <w:t>1.2 实习汇报关系</w:t>
+        <w:t>1.2 目标与范围</w:t>
       </w:r>
     </w:p>
     <w:p>
@@ -1164,78 +1146,7 @@
         <w:jc w:val="both"/>
       </w:pPr>
       <w:r>
-        <w:t>已知的实习汇报关系为：企业主管 Christopher Kong San Hor（IT Technician）向软件工程实习生 Wong Sook En 提供指导。这里只说明计划支持的实习关系，不将其当作已经核实的完整公司组织架构。</w:t>
-      </w:r>
-    </w:p>
-    <w:p>
-      <w:pPr>
-        <w:pStyle w:val="Heading2"/>
-      </w:pPr>
-      <w:r>
-        <w:t>1.3 项目背景与问题定义</w:t>
-      </w:r>
-    </w:p>
-    <w:p>
-      <w:pPr>
-        <w:widowControl/>
-        <w:jc w:val="both"/>
-      </w:pPr>
-      <w:r>
-        <w:t>原有流程是工人扫描商品二维码后填写 Google Form。拟议改善是将商品识别、员工资料、数量和照片凭证与一致的库存计算连接起来，同时让管理员能够检查余额及辨认需要补货的商品。</w:t>
-      </w:r>
-    </w:p>
-    <w:p>
-      <w:pPr>
-        <w:widowControl/>
-        <w:ind w:firstLine="720"/>
-        <w:jc w:val="both"/>
-      </w:pPr>
-      <w:r>
-        <w:t>核心问题不仅是制作网上表单，也涉及流程和数据管理。系统需要区分进货与领货、把每笔操作对应到商品、防止意外重复处理，并限制库存管理操作只能由管理员执行。网站方案让工人继续使用手机相机作为主要入口。</w:t>
-      </w:r>
-    </w:p>
-    <w:p>
-      <w:pPr>
-        <w:pStyle w:val="Heading2"/>
-      </w:pPr>
-      <w:r>
-        <w:t>1.4 项目目标与范围</w:t>
-      </w:r>
-    </w:p>
-    <w:p>
-      <w:pPr>
-        <w:widowControl/>
-        <w:jc w:val="both"/>
-      </w:pPr>
-      <w:r>
-        <w:t>项目目标包括明确扫码进入商品表单的流程、记录进出货、关联照片及根据交易计算库存。其他需求涵盖每件商品的补货警戒值、管理员维护商品、纠正错误记录、公司名称与 Logo，以及打印带商品资料和照片的指定二维码标签。</w:t>
-      </w:r>
-    </w:p>
-    <w:p>
-      <w:pPr>
-        <w:widowControl/>
-        <w:ind w:firstLine="720"/>
-        <w:jc w:val="both"/>
-      </w:pPr>
-      <w:r>
-        <w:t>首阶段采用手机友好的网站与 Google 服务，不开发原生 Android 或 iOS 应用。WhatsApp、Telegram 与 SMS 整合暂缓。已核实的个人员工账号、完整采购系统、离线同步及大型仓库管理也不属于初始范围，以便将项目控制在约一个月内。</w:t>
-      </w:r>
-    </w:p>
-    <w:p>
-      <w:pPr>
-        <w:pStyle w:val="Heading2"/>
-      </w:pPr>
-      <w:r>
-        <w:t>1.5 报告范围与项目安排</w:t>
-      </w:r>
-    </w:p>
-    <w:p>
-      <w:pPr>
-        <w:widowControl/>
-        <w:jc w:val="both"/>
-      </w:pPr>
-      <w:r>
-        <w:t>本稿编写于 2026 年 10 月 21 日，为阶段性项目报告。周记录涵盖 10 月 12–24 日，未来工作另列为计划。第一个项目拟安排至 11 月 7 日，并不代表已完成延续至 2027 年 1 月的整个实习。后续日期的进展及结论须根据实际记录更新。</w:t>
+        <w:t>目标是简化扫码记录、自动计算库存，并提供商品维护、错误记录更正、补货提醒，以及附照片的二维码标签打印。方案使用现有 Google 服务，不开发原生手机应用。额外消息渠道暂不纳入本阶段范围。</w:t>
       </w:r>
     </w:p>
     <w:p>
@@ -1256,7 +1167,7 @@
         <w:pStyle w:val="Heading2"/>
       </w:pPr>
       <w:r>
-        <w:t>2.1 需求收集与现有资料</w:t>
+        <w:t>2.1 需求与技术选型</w:t>
       </w:r>
     </w:p>
     <w:p>
@@ -1265,7 +1176,7 @@
         <w:jc w:val="both"/>
       </w:pPr>
       <w:r>
-        <w:t>我通过线上讨论与线下会议了解客户的操作方式。库存资料列出了商品类别、编号、名称、期初数量及单位；二维码 PDF 则说明标签及扫码的应用方式。我把这些内容视作需要核对的资料来源，而不是默认所有字段和余额都准确。</w:t>
+        <w:t>我查阅客户提供的库存表、Google Form 和商品二维码 PDF，并通过线上及线下沟通理解需求。主要要求包括扫描对应商品、输入员工 ID 和数量、提供照片、区分管理员权限，以及每件商品独立的补货警戒值。</w:t>
       </w:r>
     </w:p>
     <w:p>
@@ -1275,7 +1186,7 @@
         <w:jc w:val="both"/>
       </w:pPr>
       <w:r>
-        <w:t>沟通重点包括区分工人和管理员需要看到的资料。工人应看到商品名称、图片及单位，具体库存只供管理员查看。记录字段由员工姓名调整为员工 ID。PAIR、PCS、PACK 和 KG 等单位需要分别处理，部分商品数量也可能使用小数。</w:t>
+        <w:t>界面选择 HTML、CSS 和 JavaScript，后台使用 Google Apps Script，Google Sheets 保存商品与交易记录，Google Drive 储存照片。网站让工人通过手机相机直接进入商品表单，无须安装应用。</w:t>
       </w:r>
     </w:p>
     <w:p>
@@ -1283,7 +1194,7 @@
         <w:pStyle w:val="Heading2"/>
       </w:pPr>
       <w:r>
-        <w:t>2.2 网站与原生应用方案比较</w:t>
+        <w:t>2.2 流程与初步原型</w:t>
       </w:r>
     </w:p>
     <w:p>
@@ -1292,7 +1203,7 @@
         <w:jc w:val="both"/>
       </w:pPr>
       <w:r>
-        <w:t>手机友好的网站能够保留原来的扫码习惯。二维码可包含网站地址和商品编号，让手机相机直接打开对应表单。工人无须安装独立原生应用，管理员也能在电脑上使用同一服务。</w:t>
+        <w:t>工人流程为扫描二维码、确认商品、填写员工 ID 和数量、附照片及提交。管理员可维护商品、查看库存、更正误填记录及打印指定标签。库存计算规则为期初库存加有效进货，再减有效领货。</w:t>
       </w:r>
     </w:p>
     <w:p>
@@ -1302,125 +1213,7 @@
         <w:jc w:val="both"/>
       </w:pPr>
       <w:r>
-        <w:t>这个方案仍有局限：提交需要网络，手机浏览器的相机行为可能不同，主屏幕快捷方式也不等于原生推送。网页弹窗需要打开管理员页面；邮件可在页面外提醒管理员，其他消息渠道则需要额外整合。</w:t>
-      </w:r>
-    </w:p>
-    <w:p>
-      <w:pPr>
-        <w:pStyle w:val="Heading2"/>
-      </w:pPr>
-      <w:r>
-        <w:t>2.3 开发语言与工具</w:t>
-      </w:r>
-    </w:p>
-    <w:p>
-      <w:pPr>
-        <w:widowControl/>
-        <w:jc w:val="both"/>
-      </w:pPr>
-      <w:r>
-        <w:t>HTML 定义表单、表格、对话框及打印标签结构；CSS 负责排版、颜色、响应式布局和打印样式；JavaScript 负责交互、验证、图片处理及二维码生成。Google Apps Script 同样使用 JavaScript，提供后台处理、读取或更新 Google Sheets 及将照片存入 Drive 的功能。虽然实习计划列有 Java，本网站方案并不需要使用它。</w:t>
-      </w:r>
-    </w:p>
-    <w:p>
-      <w:pPr>
-        <w:widowControl/>
-        <w:ind w:firstLine="720"/>
-        <w:jc w:val="both"/>
-      </w:pPr>
-      <w:r>
-        <w:t>Google Sheets 适合作为初期小团队的记录存储，Google Drive 用于照片文件，GitHub 用于版本管理及说明文件，Microsoft Word 用于报告。这些工具能降低初始架构复杂度，但权限、验证、服务配额与恢复安排仍不可忽略。</w:t>
-      </w:r>
-    </w:p>
-    <w:p>
-      <w:pPr>
-        <w:pStyle w:val="Heading2"/>
-      </w:pPr>
-      <w:r>
-        <w:t>2.4 系统架构与数据设计</w:t>
-      </w:r>
-    </w:p>
-    <w:p>
-      <w:pPr>
-        <w:widowControl/>
-        <w:jc w:val="both"/>
-      </w:pPr>
-      <w:r>
-        <w:t>架构将使用界面与数据修改操作分开。浏览器负责显示表单和提交请求，Apps Script 在写入前验证。不能只通过隐藏页面数字来保护库存，后台同样需要控制管理员资料与操作。</w:t>
-      </w:r>
-    </w:p>
-    <w:p>
-      <w:pPr>
-        <w:widowControl/>
-        <w:ind w:firstLine="720"/>
-        <w:jc w:val="both"/>
-      </w:pPr>
-      <w:r>
-        <w:t>Products 表保存商品编号、名称、类别、单位、期初库存、警戒值、图片引用和商品状态。Transactions 保存请求编号、时间、商品、进出类型、数量、员工 ID、备注和照片引用。Settings 保存公司名称与 Logo。商品编号应保持稳定，让原有二维码和历史记录仍指向同一商品。</w:t>
-      </w:r>
-    </w:p>
-    <w:p>
-      <w:pPr>
-        <w:widowControl/>
-        <w:ind w:firstLine="720"/>
-        <w:jc w:val="both"/>
-      </w:pPr>
-      <w:r>
-        <w:t>当前库存定义为期初库存加有效进货，再减有效领货。错误记录经过管理员更正后不再参与计算，但保留原始行以便核对。删除进货若造成负库存，则必须拒绝。</w:t>
-      </w:r>
-    </w:p>
-    <w:p>
-      <w:pPr>
-        <w:pStyle w:val="Heading2"/>
-      </w:pPr>
-      <w:r>
-        <w:t>2.5 二维码识别与打印标签</w:t>
-      </w:r>
-    </w:p>
-    <w:p>
-      <w:pPr>
-        <w:widowControl/>
-        <w:jc w:val="both"/>
-      </w:pPr>
-      <w:r>
-        <w:t>商品二维码包含部署网址和 item 参数，工人打开后可自动选中对应商品。找不到或已停用的商品不能悄悄变成另一件商品，应提示联系管理员，或由使用者明确选择有效商品。</w:t>
-      </w:r>
-    </w:p>
-    <w:p>
-      <w:pPr>
-        <w:widowControl/>
-        <w:ind w:firstLine="720"/>
-        <w:jc w:val="both"/>
-      </w:pPr>
-      <w:r>
-        <w:t>标签结合二维码、编号、名称、单位及可用照片，也可以加货架或仓位文字。管理员可以选择单件、多件或全部打印，并移除误选项。实际使用前必须检查目标网址及纸上扫码效果，不能只以画面有二维码就判断流程成功。</w:t>
-      </w:r>
-    </w:p>
-    <w:p>
-      <w:pPr>
-        <w:pStyle w:val="Heading2"/>
-      </w:pPr>
-      <w:r>
-        <w:t>2.6 权限、验证与限制</w:t>
-      </w:r>
-    </w:p>
-    <w:p>
-      <w:pPr>
-        <w:widowControl/>
-        <w:jc w:val="both"/>
-      </w:pPr>
-      <w:r>
-        <w:t>初期使用后台核对的共用管理员密码，属于有限管理机制，不是完整个人账号系统。员工 ID 是自行填写的值，不代表已验证身份。如果允许匿名访问，持有网址的人便可能提交领货，推广使用前必须了解这个限制。</w:t>
-      </w:r>
-    </w:p>
-    <w:p>
-      <w:pPr>
-        <w:widowControl/>
-        <w:ind w:firstLine="720"/>
-        <w:jc w:val="both"/>
-      </w:pPr>
-      <w:r>
-        <w:t>其他考虑包括正数数量、小数单位、库存不足处理、文件格式与大小检查、重复请求编号，以及库存更新串行处理。照片不应意外公开。Apps Script、邮件和 Drive 有配额；随着交易增加，逐行计算库存也需要优化。</w:t>
+        <w:t>研究和初步开发后，已具备供客户检视的原型。设计考虑包括数量验证、库存不足拦截、防止重复提交及后台管理权限检查。员工 ID 仍是自行填写，共用管理员密码也属于初版限制。</w:t>
       </w:r>
     </w:p>
     <w:p>
@@ -1441,7 +1234,7 @@
         <w:pStyle w:val="Heading2"/>
       </w:pPr>
       <w:r>
-        <w:t>3.1 第一周：客户沟通与需求分析</w:t>
+        <w:t>3.1 第一周：需求与流程理解（10 月 12–17 日）</w:t>
       </w:r>
     </w:p>
     <w:p>
@@ -1450,17 +1243,7 @@
         <w:jc w:val="both"/>
       </w:pPr>
       <w:r>
-        <w:t>第一周报告区间为 2026 年 10 月 12–17 日，重点是了解库存管理需求。线上沟通与线下会议帮助我把操作描述整理成需求清单，并查阅库存表、Google Form 入口和商品二维码资料。</w:t>
-      </w:r>
-    </w:p>
-    <w:p>
-      <w:pPr>
-        <w:widowControl/>
-        <w:ind w:firstLine="720"/>
-        <w:jc w:val="both"/>
-      </w:pPr>
-      <w:r>
-        <w:t>我区分工人领用流程与管理员监控流程，厘清进货和领货对库存的影响，也研究网站能否比原生应用更简单地满足需要。该阶段的预期产出是需求草稿与流程概要，不是宣称整个系统已交付。</w:t>
+        <w:t>我通过线上沟通和线下会议了解工人领货及管理员检查库存的方式，查阅现有库存资料和扫码进入表单的流程，识别所需字段并整理初步需求。我也拟定工人与管理员流程，并探索可行的网站方案。</w:t>
       </w:r>
     </w:p>
     <w:p>
@@ -1468,7 +1251,7 @@
         <w:pStyle w:val="Heading2"/>
       </w:pPr>
       <w:r>
-        <w:t>3.2 第二周：技术探索与初步设计</w:t>
+        <w:t>3.2 第二周：研究、设计与初步开发（10 月 19–24 日）</w:t>
       </w:r>
     </w:p>
     <w:p>
@@ -1477,17 +1260,7 @@
         <w:jc w:val="both"/>
       </w:pPr>
       <w:r>
-        <w:t>第二周区间为 2026 年 10 月 19–24 日。本稿记录截至 21 日的研究与流程规划，包括 HTML、CSS、JavaScript、Apps Script、Sheets 和 Drive 的用途，以及需要的数据字段与处理步骤。</w:t>
-      </w:r>
-    </w:p>
-    <w:p>
-      <w:pPr>
-        <w:widowControl/>
-        <w:ind w:firstLine="720"/>
-        <w:jc w:val="both"/>
-      </w:pPr>
-      <w:r>
-        <w:t>10 月 22–24 日计划准备页面草图、与客户检视流程和确定开发优先次序，不提前写成已经完成。这有助于保持实习日志准确，避免将安排表误当作已发生的工作。</w:t>
+        <w:t>截至 10 月 21 日，工作集中于工具选择、商品与交易数据设计，以及初步网站开发。原型整合了二维码商品选择、员工 ID、数量、照片、库存计算及管理员功能。本周其余时间安排检查原型并准备交给客户检视。正式验收及客户要求的修改仍待确认。</w:t>
       </w:r>
     </w:p>
     <w:p>
@@ -1495,7 +1268,7 @@
         <w:pStyle w:val="Heading2"/>
       </w:pPr>
       <w:r>
-        <w:t>3.3 第三、四周计划</w:t>
+        <w:t>3.3 第三周：客户检视与试运行（10 月 26–31 日，计划）</w:t>
       </w:r>
     </w:p>
     <w:p>
@@ -1504,17 +1277,7 @@
         <w:jc w:val="both"/>
       </w:pPr>
       <w:r>
-        <w:t>第三周 10 月 26–31 日安排核心原型：工人和管理员界面、商品二维码入口、员工 ID、数量、照片、进出货，以及 Sheets 和 Drive 整合。应先使用独立测试商品，再扩大清单或使用真实余额。</w:t>
-      </w:r>
-    </w:p>
-    <w:p>
-      <w:pPr>
-        <w:widowControl/>
-        <w:ind w:firstLine="720"/>
-        <w:jc w:val="both"/>
-      </w:pPr>
-      <w:r>
-        <w:t>第四周 11 月 2–7 日安排完善、整合测试、客户反馈及交接准备。功能包括商品维护、管理员更正记录、公司标识、选定标签打印和补货提醒。交付须依据实际测试与验收，若范围超出时间，应重新排定优先次序。</w:t>
+        <w:t>第三周安排客户检视及试用网站。试运行重点包括扫描已打印标签、进入正确商品、提交进出货、查看照片及核对库存变化。意见与问题将记录并安排优先次序；具体修改内容先保留，等待客户反馈。</w:t>
       </w:r>
     </w:p>
     <w:p>
@@ -1522,7 +1285,7 @@
         <w:pStyle w:val="Heading2"/>
       </w:pPr>
       <w:r>
-        <w:t>3.4 沟通、自主学习与解决问题</w:t>
+        <w:t>3.4 第四周：后续测试与维护（11 月 2–7 日，计划）</w:t>
       </w:r>
     </w:p>
     <w:p>
@@ -1531,34 +1294,7 @@
         <w:jc w:val="both"/>
       </w:pPr>
       <w:r>
-        <w:t>项目需要把实际问题转成明确行为，例如谁能看到库存、扫码后发生什么、何时补货提醒，以及填错记录如何更正。我尝试清楚说明这些行为，并在设计确定前取得反馈。</w:t>
-      </w:r>
-    </w:p>
-    <w:p>
-      <w:pPr>
-        <w:widowControl/>
-        <w:ind w:firstLine="720"/>
-        <w:jc w:val="both"/>
-      </w:pPr>
-      <w:r>
-        <w:t>自主学习集中于 JavaScript、Apps Script，以及电子表格、上传文件和网页之间的关系。解决问题时应检查具体错误、区分前端与后台或权限问题，并在有实质调整后重试。更新部署前先测试，也有助于保护正在使用的版本。</w:t>
-      </w:r>
-    </w:p>
-    <w:p>
-      <w:pPr>
-        <w:pStyle w:val="Heading2"/>
-      </w:pPr>
-      <w:r>
-        <w:t>3.5 学习成果对应</w:t>
-      </w:r>
-    </w:p>
-    <w:p>
-      <w:pPr>
-        <w:widowControl/>
-        <w:jc w:val="both"/>
-      </w:pPr>
-      <w:r>
-        <w:t>CO1 对应需求分析、流程建模及数据设计；CO2 对应网页语言、Google 服务、二维码和版本管理；CO5 对应客户沟通与书面说明；CO6 对应独立研究及与客户或主管讨论；CO7 对应学习新工具并根据反馈改进。这些是学习反思的对应关系，不能代替主管确认或正式评分。</w:t>
+        <w:t>第四周安排继续试运行、验证与客户确认的改动，并进行初期维护。修改内容取决于实际反馈，不预先声称已修复某个问题。实际改动、复测结果与交接状态将在确认后补入。</w:t>
       </w:r>
     </w:p>
     <w:p>
@@ -1579,7 +1315,7 @@
         <w:pStyle w:val="Heading2"/>
       </w:pPr>
       <w:r>
-        <w:t>4.1 需求及设计产出</w:t>
+        <w:t>4.1 主要任务与验证</w:t>
       </w:r>
     </w:p>
     <w:p>
@@ -1588,7 +1324,7 @@
         <w:jc w:val="both"/>
       </w:pPr>
       <w:r>
-        <w:t>本阶段产出包括需求清单、工人和管理员流程、技术选型和初步数据模型。工人界面拟用于确认商品和提交操作，管理员界面拟用于管理商品、检查库存、更正错误及生成标签。附录将这些要求整理成可继续与客户完善的形式。</w:t>
+        <w:t>项目工作涵盖需求、流程与数据设计、初步网页原型及客户测试准备。试运行应检查二维码对应商品、库存加减、照片读取、指定标签打印及管理员记录更正。仅能打开页面不足以证明这些功能正确。</w:t>
       </w:r>
     </w:p>
     <w:p>
@@ -1596,7 +1332,7 @@
         <w:pStyle w:val="Heading2"/>
       </w:pPr>
       <w:r>
-        <w:t>4.2 功能验证计划</w:t>
+        <w:t>4.2 数据责任与学习</w:t>
       </w:r>
     </w:p>
     <w:p>
@@ -1605,71 +1341,7 @@
         <w:jc w:val="both"/>
       </w:pPr>
       <w:r>
-        <w:t>验证应根据真实业务场景，而不是只看页面能否打开。二维码应指向正确商品；领货应减少库存，进货应增加；库存不足时应拒绝；授权人员应能查看已保存照片。管理员删除记录应只撤销一次库存影响、保留核查资料，并拒绝产生负库存的更正。</w:t>
-      </w:r>
-    </w:p>
-    <w:p>
-      <w:pPr>
-        <w:widowControl/>
-        <w:ind w:firstLine="720"/>
-        <w:jc w:val="both"/>
-      </w:pPr>
-      <w:r>
-        <w:t>附录列出测试案例及预期结果。本报告未取得正式带日期的执行记录、截图与客户验收证据，因此该表是测试计划，不虚构通过结果。实际执行后才可填写结果。</w:t>
-      </w:r>
-    </w:p>
-    <w:p>
-      <w:pPr>
-        <w:pStyle w:val="Heading2"/>
-      </w:pPr>
-      <w:r>
-        <w:t>4.3 数据准确性与授权访问</w:t>
-      </w:r>
-    </w:p>
-    <w:p>
-      <w:pPr>
-        <w:widowControl/>
-        <w:jc w:val="both"/>
-      </w:pPr>
-      <w:r>
-        <w:t>正式使用前应盘点并核实期初库存，测试交易应明确标识并使用适当机制更正。手动删除电子表格行可能破坏可追溯性，应尽量避免。管理员更正应保留原记录、删除时间和原因，同时将该笔交易排除于有效库存计算。</w:t>
-      </w:r>
-    </w:p>
-    <w:p>
-      <w:pPr>
-        <w:widowControl/>
-        <w:ind w:firstLine="720"/>
-        <w:jc w:val="both"/>
-      </w:pPr>
-      <w:r>
-        <w:t>共用管理员密码意味着持有人权限相同。密码应私下传递，不应出现在公开代码、截图或报告。分享网站与分享私人 Drive 照片权限是不同操作，增加使用者前应检视访问需要。</w:t>
-      </w:r>
-    </w:p>
-    <w:p>
-      <w:pPr>
-        <w:pStyle w:val="Heading2"/>
-      </w:pPr>
-      <w:r>
-        <w:t>4.4 专业行为与报告诚信</w:t>
-      </w:r>
-    </w:p>
-    <w:p>
-      <w:pPr>
-        <w:widowControl/>
-        <w:jc w:val="both"/>
-      </w:pPr>
-      <w:r>
-        <w:t>专业实践包括谨慎处理客户资料、遵守授权范围、保持记录准确，以及如实说明限制。实习计划中的 CO3 和 CO4 包含这些责任。由于没有提供具体内部政策，本稿不会宣称已符合某个特定合规标准或通过正式安全审计。</w:t>
-      </w:r>
-    </w:p>
-    <w:p>
-      <w:pPr>
-        <w:widowControl/>
-        <w:ind w:firstLine="720"/>
-        <w:jc w:val="both"/>
-      </w:pPr>
-      <w:r>
-        <w:t>报告区分已知需求、技术设计与未来计划，不捏造会议出席、工时、主管批准、测试证据或客户验收。学生应核对事实、根据自身理解修订，并依大学对辅助写作的要求处理后，才签署正式声明。</w:t>
+        <w:t>正式使用前须核实期初库存，清楚标识测试记录，并在更正时保留核查资料。密码与私人照片链接不应公开。项目促进软件设计及工具应用能力（CO1–CO2）、沟通与自主学习（CO5–CO7），以及负责任地处理客户资料（CO3–CO4）。</w:t>
       </w:r>
     </w:p>
     <w:p>
@@ -1682,7 +1354,7 @@
         <w:pStyle w:val="Heading1"/>
       </w:pPr>
       <w:r>
-        <w:t>第五章——阶段总结与后续工作</w:t>
+        <w:t>第五章——阶段总结</w:t>
       </w:r>
     </w:p>
     <w:p>
@@ -1690,7 +1362,7 @@
         <w:pStyle w:val="Heading2"/>
       </w:pPr>
       <w:r>
-        <w:t>5.1 阶段性结论</w:t>
+        <w:t>5.1 当前状态与后续工作</w:t>
       </w:r>
     </w:p>
     <w:p>
@@ -1699,111 +1371,7 @@
         <w:jc w:val="both"/>
       </w:pPr>
       <w:r>
-        <w:t>初期工作为通过二维码和手机网站改善库存记录建立了方向。需求分析指出，工人最重要的操作是扫码后进入正确商品表单；将商品、交易、照片及管理设置分开，也为后续实施提供更清晰的基础。</w:t>
-      </w:r>
-    </w:p>
-    <w:p>
-      <w:pPr>
-        <w:widowControl/>
-        <w:ind w:firstLine="720"/>
-        <w:jc w:val="both"/>
-      </w:pPr>
-      <w:r>
-        <w:t>当前学习重点是客户沟通、技术评估和一致的库存流程设计。需要继续完善的领域包括身份与访问控制、系统化测试证据、实际库存核对，以及服务配额。本节是第一个项目的阶段结论，并非整个实习的最终评价。</w:t>
-      </w:r>
-    </w:p>
-    <w:p>
-      <w:pPr>
-        <w:pStyle w:val="Heading2"/>
-      </w:pPr>
-      <w:r>
-        <w:t>5.2 后续工作与未来改善</w:t>
-      </w:r>
-    </w:p>
-    <w:p>
-      <w:pPr>
-        <w:widowControl/>
-        <w:jc w:val="both"/>
-      </w:pPr>
-      <w:r>
-        <w:t>后续安排是开发或完善已确认原型、执行代表性测试、确认初始库存、收集反馈，并准备部署及使用说明。最终报告须把计划内容替换为核实成果，并加入适合公开的证据。</w:t>
-      </w:r>
-    </w:p>
-    <w:p>
-      <w:pPr>
-        <w:widowControl/>
-        <w:ind w:firstLine="720"/>
-        <w:jc w:val="both"/>
-      </w:pPr>
-      <w:r>
-        <w:t>未来可考虑个人管理员账号、更可靠的员工验证、数据库优化及其他通知渠道。迁往公司管理的 Google 账号，也需要规划表格与照片权限、部署所有权和二维码网址变化。这些是后续方向，并非首个月内全部完成的承诺。</w:t>
-      </w:r>
-    </w:p>
-    <w:p>
-      <w:r>
-        <w:br w:type="page"/>
-      </w:r>
-    </w:p>
-    <w:p>
-      <w:pPr>
-        <w:pStyle w:val="Heading1"/>
-      </w:pPr>
-      <w:r>
-        <w:t>参考资料</w:t>
-      </w:r>
-    </w:p>
-    <w:p>
-      <w:pPr>
-        <w:widowControl/>
-        <w:jc w:val="both"/>
-      </w:pPr>
-      <w:r>
-        <w:t>Universiti Tunku Abdul Rahman (2024) GD008 IT Report Template 2024. User-supplied report template.</w:t>
-      </w:r>
-    </w:p>
-    <w:p>
-      <w:pPr>
-        <w:widowControl/>
-        <w:jc w:val="both"/>
-      </w:pPr>
-      <w:r>
-        <w:t>Universiti Tunku Abdul Rahman (n.d.) GD007 IT Report Guidelines, LKC FES, revision 06 (Non-QS). User-supplied guidelines.</w:t>
-      </w:r>
-    </w:p>
-    <w:p>
-      <w:pPr>
-        <w:widowControl/>
-        <w:jc w:val="both"/>
-      </w:pPr>
-      <w:r>
-        <w:t>Universiti Tunku Abdul Rahman (2026) Industrial Training Plan, FM-FES-ITC-004, revision 4. Prepared by Wong Sook En; dated 13 October 2026. User-supplied document.</w:t>
-      </w:r>
-    </w:p>
-    <w:p>
-      <w:pPr>
-        <w:widowControl/>
-        <w:jc w:val="both"/>
-      </w:pPr>
-      <w:r>
-        <w:t>Client-supplied materials (n.d.) STORE INVENTORY SYSTEM — Google spreadsheet export and DU01–DU16 Individual QR and Images PDF. Internal project references; no private operational URLs reproduced.</w:t>
-      </w:r>
-    </w:p>
-    <w:p>
-      <w:pPr>
-        <w:widowControl/>
-        <w:jc w:val="both"/>
-      </w:pPr>
-      <w:r>
-        <w:t>Google (n.d.) Apps Script documentation. Available at: https://developers.google.com/apps-script/ (technical reference for further verification).</w:t>
-      </w:r>
-    </w:p>
-    <w:p>
-      <w:pPr>
-        <w:widowControl/>
-        <w:jc w:val="both"/>
-      </w:pPr>
-      <w:r>
-        <w:t>MDN Web Docs (n.d.) HTML, CSS and JavaScript documentation. Available at: https://developer.mozilla.org/ (technical reference for further verification).</w:t>
+        <w:t>研究与初步原型已为客户试运行建立基础。接下来是收集反馈、确定必要修改，并在检视日常库存记录适用性的过程中维护网站。本稿日期为 2026 年 10 月 21 日，第三、四周属于未来安排；实际意见、改动及验收之后补入。本项目只是较长实习报告中的第一部分。</w:t>
       </w:r>
     </w:p>
     <w:p>
@@ -2531,7 +2099,7 @@
                 <w:b w:val="0"/>
                 <w:sz w:val="20"/>
               </w:rPr>
-              <w:t>研究、流程、数据设计与草图</w:t>
+              <w:t>研究、设计与初步原型</w:t>
             </w:r>
           </w:p>
         </w:tc>
@@ -2587,7 +2155,7 @@
                 <w:b w:val="0"/>
                 <w:sz w:val="20"/>
               </w:rPr>
-              <w:t>核心开发与整合</w:t>
+              <w:t>客户检视、试运行与反馈；修改待确认</w:t>
             </w:r>
           </w:p>
         </w:tc>
@@ -2643,7 +2211,7 @@
                 <w:b w:val="0"/>
                 <w:sz w:val="20"/>
               </w:rPr>
-              <w:t>完善、测试、反馈与交接</w:t>
+              <w:t>按客户反馈复测与维护</w:t>
             </w:r>
           </w:p>
         </w:tc>
@@ -2983,7 +2551,7 @@
                 <w:b w:val="0"/>
                 <w:sz w:val="20"/>
               </w:rPr>
-              <w:t>T4</w:t>
+              <w:t>T6</w:t>
             </w:r>
           </w:p>
         </w:tc>
@@ -3001,7 +2569,7 @@
                 <w:b w:val="0"/>
                 <w:sz w:val="20"/>
               </w:rPr>
-              <w:t>领货超过库存</w:t>
+              <w:t>删除错误领货</w:t>
             </w:r>
           </w:p>
         </w:tc>
@@ -3019,7 +2587,7 @@
                 <w:b w:val="0"/>
                 <w:sz w:val="20"/>
               </w:rPr>
-              <w:t>拒绝请求，不扣库存</w:t>
+              <w:t>只加回一次，保留核查记录</w:t>
             </w:r>
           </w:p>
         </w:tc>
@@ -3057,7 +2625,7 @@
                 <w:b w:val="0"/>
                 <w:sz w:val="20"/>
               </w:rPr>
-              <w:t>T5</w:t>
+              <w:t>T8</w:t>
             </w:r>
           </w:p>
         </w:tc>
@@ -3075,7 +2643,7 @@
                 <w:b w:val="0"/>
                 <w:sz w:val="20"/>
               </w:rPr>
-              <w:t>重试同一请求</w:t>
+              <w:t>多选标签并移除一项</w:t>
             </w:r>
           </w:p>
         </w:tc>
@@ -3093,7 +2661,7 @@
                 <w:b w:val="0"/>
                 <w:sz w:val="20"/>
               </w:rPr>
-              <w:t>不重复扣货</w:t>
+              <w:t>只打印剩余选项</w:t>
             </w:r>
           </w:p>
         </w:tc>
@@ -3131,7 +2699,7 @@
                 <w:b w:val="0"/>
                 <w:sz w:val="20"/>
               </w:rPr>
-              <w:t>T6</w:t>
+              <w:t>T12</w:t>
             </w:r>
           </w:p>
         </w:tc>
@@ -3149,7 +2717,7 @@
                 <w:b w:val="0"/>
                 <w:sz w:val="20"/>
               </w:rPr>
-              <w:t>删除错误领货</w:t>
+              <w:t>上传并查看照片</w:t>
             </w:r>
           </w:p>
         </w:tc>
@@ -3167,7 +2735,7 @@
                 <w:b w:val="0"/>
                 <w:sz w:val="20"/>
               </w:rPr>
-              <w:t>只加回一次，保留核查记录</w:t>
+              <w:t>授权人员能读取正确照片</w:t>
             </w:r>
           </w:p>
         </w:tc>
@@ -3190,612 +2758,7 @@
           </w:p>
         </w:tc>
       </w:tr>
-      <w:tr>
-        <w:tc>
-          <w:tcPr>
-            <w:tcW w:type="dxa" w:w="2582"/>
-          </w:tcPr>
-          <w:p>
-            <w:pPr>
-              <w:spacing w:line="276" w:lineRule="auto" w:after="120"/>
-            </w:pPr>
-            <w:r>
-              <w:rPr>
-                <w:rFonts w:ascii="Times New Roman" w:hAnsi="Times New Roman" w:eastAsia="SimSun"/>
-                <w:b w:val="0"/>
-                <w:sz w:val="20"/>
-              </w:rPr>
-              <w:t>T7</w:t>
-            </w:r>
-          </w:p>
-        </w:tc>
-        <w:tc>
-          <w:tcPr>
-            <w:tcW w:type="dxa" w:w="2582"/>
-          </w:tcPr>
-          <w:p>
-            <w:pPr>
-              <w:spacing w:line="276" w:lineRule="auto" w:after="120"/>
-            </w:pPr>
-            <w:r>
-              <w:rPr>
-                <w:rFonts w:ascii="Times New Roman" w:hAnsi="Times New Roman" w:eastAsia="SimSun"/>
-                <w:b w:val="0"/>
-                <w:sz w:val="20"/>
-              </w:rPr>
-              <w:t>删除进货会造成负数</w:t>
-            </w:r>
-          </w:p>
-        </w:tc>
-        <w:tc>
-          <w:tcPr>
-            <w:tcW w:type="dxa" w:w="2582"/>
-          </w:tcPr>
-          <w:p>
-            <w:pPr>
-              <w:spacing w:line="276" w:lineRule="auto" w:after="120"/>
-            </w:pPr>
-            <w:r>
-              <w:rPr>
-                <w:rFonts w:ascii="Times New Roman" w:hAnsi="Times New Roman" w:eastAsia="SimSun"/>
-                <w:b w:val="0"/>
-                <w:sz w:val="20"/>
-              </w:rPr>
-              <w:t>拒绝更正</w:t>
-            </w:r>
-          </w:p>
-        </w:tc>
-        <w:tc>
-          <w:tcPr>
-            <w:tcW w:type="dxa" w:w="2582"/>
-          </w:tcPr>
-          <w:p>
-            <w:pPr>
-              <w:spacing w:line="276" w:lineRule="auto" w:after="120"/>
-            </w:pPr>
-            <w:r>
-              <w:rPr>
-                <w:rFonts w:ascii="Times New Roman" w:hAnsi="Times New Roman" w:eastAsia="SimSun"/>
-                <w:b w:val="0"/>
-                <w:sz w:val="20"/>
-              </w:rPr>
-              <w:t>待执行／补证据</w:t>
-            </w:r>
-          </w:p>
-        </w:tc>
-      </w:tr>
-      <w:tr>
-        <w:tc>
-          <w:tcPr>
-            <w:tcW w:type="dxa" w:w="2582"/>
-          </w:tcPr>
-          <w:p>
-            <w:pPr>
-              <w:spacing w:line="276" w:lineRule="auto" w:after="120"/>
-            </w:pPr>
-            <w:r>
-              <w:rPr>
-                <w:rFonts w:ascii="Times New Roman" w:hAnsi="Times New Roman" w:eastAsia="SimSun"/>
-                <w:b w:val="0"/>
-                <w:sz w:val="20"/>
-              </w:rPr>
-              <w:t>T8</w:t>
-            </w:r>
-          </w:p>
-        </w:tc>
-        <w:tc>
-          <w:tcPr>
-            <w:tcW w:type="dxa" w:w="2582"/>
-          </w:tcPr>
-          <w:p>
-            <w:pPr>
-              <w:spacing w:line="276" w:lineRule="auto" w:after="120"/>
-            </w:pPr>
-            <w:r>
-              <w:rPr>
-                <w:rFonts w:ascii="Times New Roman" w:hAnsi="Times New Roman" w:eastAsia="SimSun"/>
-                <w:b w:val="0"/>
-                <w:sz w:val="20"/>
-              </w:rPr>
-              <w:t>多选标签并移除一项</w:t>
-            </w:r>
-          </w:p>
-        </w:tc>
-        <w:tc>
-          <w:tcPr>
-            <w:tcW w:type="dxa" w:w="2582"/>
-          </w:tcPr>
-          <w:p>
-            <w:pPr>
-              <w:spacing w:line="276" w:lineRule="auto" w:after="120"/>
-            </w:pPr>
-            <w:r>
-              <w:rPr>
-                <w:rFonts w:ascii="Times New Roman" w:hAnsi="Times New Roman" w:eastAsia="SimSun"/>
-                <w:b w:val="0"/>
-                <w:sz w:val="20"/>
-              </w:rPr>
-              <w:t>只打印剩余选项</w:t>
-            </w:r>
-          </w:p>
-        </w:tc>
-        <w:tc>
-          <w:tcPr>
-            <w:tcW w:type="dxa" w:w="2582"/>
-          </w:tcPr>
-          <w:p>
-            <w:pPr>
-              <w:spacing w:line="276" w:lineRule="auto" w:after="120"/>
-            </w:pPr>
-            <w:r>
-              <w:rPr>
-                <w:rFonts w:ascii="Times New Roman" w:hAnsi="Times New Roman" w:eastAsia="SimSun"/>
-                <w:b w:val="0"/>
-                <w:sz w:val="20"/>
-              </w:rPr>
-              <w:t>待执行／补证据</w:t>
-            </w:r>
-          </w:p>
-        </w:tc>
-      </w:tr>
-      <w:tr>
-        <w:tc>
-          <w:tcPr>
-            <w:tcW w:type="dxa" w:w="2582"/>
-          </w:tcPr>
-          <w:p>
-            <w:pPr>
-              <w:spacing w:line="276" w:lineRule="auto" w:after="120"/>
-            </w:pPr>
-            <w:r>
-              <w:rPr>
-                <w:rFonts w:ascii="Times New Roman" w:hAnsi="Times New Roman" w:eastAsia="SimSun"/>
-                <w:b w:val="0"/>
-                <w:sz w:val="20"/>
-              </w:rPr>
-              <w:t>T9</w:t>
-            </w:r>
-          </w:p>
-        </w:tc>
-        <w:tc>
-          <w:tcPr>
-            <w:tcW w:type="dxa" w:w="2582"/>
-          </w:tcPr>
-          <w:p>
-            <w:pPr>
-              <w:spacing w:line="276" w:lineRule="auto" w:after="120"/>
-            </w:pPr>
-            <w:r>
-              <w:rPr>
-                <w:rFonts w:ascii="Times New Roman" w:hAnsi="Times New Roman" w:eastAsia="SimSun"/>
-                <w:b w:val="0"/>
-                <w:sz w:val="20"/>
-              </w:rPr>
-              <w:t>保存名称和 Logo</w:t>
-            </w:r>
-          </w:p>
-        </w:tc>
-        <w:tc>
-          <w:tcPr>
-            <w:tcW w:type="dxa" w:w="2582"/>
-          </w:tcPr>
-          <w:p>
-            <w:pPr>
-              <w:spacing w:line="276" w:lineRule="auto" w:after="120"/>
-            </w:pPr>
-            <w:r>
-              <w:rPr>
-                <w:rFonts w:ascii="Times New Roman" w:hAnsi="Times New Roman" w:eastAsia="SimSun"/>
-                <w:b w:val="0"/>
-                <w:sz w:val="20"/>
-              </w:rPr>
-              <w:t>刷新后设置仍保留</w:t>
-            </w:r>
-          </w:p>
-        </w:tc>
-        <w:tc>
-          <w:tcPr>
-            <w:tcW w:type="dxa" w:w="2582"/>
-          </w:tcPr>
-          <w:p>
-            <w:pPr>
-              <w:spacing w:line="276" w:lineRule="auto" w:after="120"/>
-            </w:pPr>
-            <w:r>
-              <w:rPr>
-                <w:rFonts w:ascii="Times New Roman" w:hAnsi="Times New Roman" w:eastAsia="SimSun"/>
-                <w:b w:val="0"/>
-                <w:sz w:val="20"/>
-              </w:rPr>
-              <w:t>待执行／补证据</w:t>
-            </w:r>
-          </w:p>
-        </w:tc>
-      </w:tr>
-      <w:tr>
-        <w:tc>
-          <w:tcPr>
-            <w:tcW w:type="dxa" w:w="2582"/>
-          </w:tcPr>
-          <w:p>
-            <w:pPr>
-              <w:spacing w:line="276" w:lineRule="auto" w:after="120"/>
-            </w:pPr>
-            <w:r>
-              <w:rPr>
-                <w:rFonts w:ascii="Times New Roman" w:hAnsi="Times New Roman" w:eastAsia="SimSun"/>
-                <w:b w:val="0"/>
-                <w:sz w:val="20"/>
-              </w:rPr>
-              <w:t>T10</w:t>
-            </w:r>
-          </w:p>
-        </w:tc>
-        <w:tc>
-          <w:tcPr>
-            <w:tcW w:type="dxa" w:w="2582"/>
-          </w:tcPr>
-          <w:p>
-            <w:pPr>
-              <w:spacing w:line="276" w:lineRule="auto" w:after="120"/>
-            </w:pPr>
-            <w:r>
-              <w:rPr>
-                <w:rFonts w:ascii="Times New Roman" w:hAnsi="Times New Roman" w:eastAsia="SimSun"/>
-                <w:b w:val="0"/>
-                <w:sz w:val="20"/>
-              </w:rPr>
-              <w:t>未授权管理请求</w:t>
-            </w:r>
-          </w:p>
-        </w:tc>
-        <w:tc>
-          <w:tcPr>
-            <w:tcW w:type="dxa" w:w="2582"/>
-          </w:tcPr>
-          <w:p>
-            <w:pPr>
-              <w:spacing w:line="276" w:lineRule="auto" w:after="120"/>
-            </w:pPr>
-            <w:r>
-              <w:rPr>
-                <w:rFonts w:ascii="Times New Roman" w:hAnsi="Times New Roman" w:eastAsia="SimSun"/>
-                <w:b w:val="0"/>
-                <w:sz w:val="20"/>
-              </w:rPr>
-              <w:t>后台拒绝</w:t>
-            </w:r>
-          </w:p>
-        </w:tc>
-        <w:tc>
-          <w:tcPr>
-            <w:tcW w:type="dxa" w:w="2582"/>
-          </w:tcPr>
-          <w:p>
-            <w:pPr>
-              <w:spacing w:line="276" w:lineRule="auto" w:after="120"/>
-            </w:pPr>
-            <w:r>
-              <w:rPr>
-                <w:rFonts w:ascii="Times New Roman" w:hAnsi="Times New Roman" w:eastAsia="SimSun"/>
-                <w:b w:val="0"/>
-                <w:sz w:val="20"/>
-              </w:rPr>
-              <w:t>待执行／补证据</w:t>
-            </w:r>
-          </w:p>
-        </w:tc>
-      </w:tr>
-      <w:tr>
-        <w:tc>
-          <w:tcPr>
-            <w:tcW w:type="dxa" w:w="2582"/>
-          </w:tcPr>
-          <w:p>
-            <w:pPr>
-              <w:spacing w:line="276" w:lineRule="auto" w:after="120"/>
-            </w:pPr>
-            <w:r>
-              <w:rPr>
-                <w:rFonts w:ascii="Times New Roman" w:hAnsi="Times New Roman" w:eastAsia="SimSun"/>
-                <w:b w:val="0"/>
-                <w:sz w:val="20"/>
-              </w:rPr>
-              <w:t>T11</w:t>
-            </w:r>
-          </w:p>
-        </w:tc>
-        <w:tc>
-          <w:tcPr>
-            <w:tcW w:type="dxa" w:w="2582"/>
-          </w:tcPr>
-          <w:p>
-            <w:pPr>
-              <w:spacing w:line="276" w:lineRule="auto" w:after="120"/>
-            </w:pPr>
-            <w:r>
-              <w:rPr>
-                <w:rFonts w:ascii="Times New Roman" w:hAnsi="Times New Roman" w:eastAsia="SimSun"/>
-                <w:b w:val="0"/>
-                <w:sz w:val="20"/>
-              </w:rPr>
-              <w:t>达到警戒值且已配置邮件</w:t>
-            </w:r>
-          </w:p>
-        </w:tc>
-        <w:tc>
-          <w:tcPr>
-            <w:tcW w:type="dxa" w:w="2582"/>
-          </w:tcPr>
-          <w:p>
-            <w:pPr>
-              <w:spacing w:line="276" w:lineRule="auto" w:after="120"/>
-            </w:pPr>
-            <w:r>
-              <w:rPr>
-                <w:rFonts w:ascii="Times New Roman" w:hAnsi="Times New Roman" w:eastAsia="SimSun"/>
-                <w:b w:val="0"/>
-                <w:sz w:val="20"/>
-              </w:rPr>
-              <w:t>尝试提醒，另核实送达</w:t>
-            </w:r>
-          </w:p>
-        </w:tc>
-        <w:tc>
-          <w:tcPr>
-            <w:tcW w:type="dxa" w:w="2582"/>
-          </w:tcPr>
-          <w:p>
-            <w:pPr>
-              <w:spacing w:line="276" w:lineRule="auto" w:after="120"/>
-            </w:pPr>
-            <w:r>
-              <w:rPr>
-                <w:rFonts w:ascii="Times New Roman" w:hAnsi="Times New Roman" w:eastAsia="SimSun"/>
-                <w:b w:val="0"/>
-                <w:sz w:val="20"/>
-              </w:rPr>
-              <w:t>待执行／补证据</w:t>
-            </w:r>
-          </w:p>
-        </w:tc>
-      </w:tr>
-      <w:tr>
-        <w:tc>
-          <w:tcPr>
-            <w:tcW w:type="dxa" w:w="2582"/>
-          </w:tcPr>
-          <w:p>
-            <w:pPr>
-              <w:spacing w:line="276" w:lineRule="auto" w:after="120"/>
-            </w:pPr>
-            <w:r>
-              <w:rPr>
-                <w:rFonts w:ascii="Times New Roman" w:hAnsi="Times New Roman" w:eastAsia="SimSun"/>
-                <w:b w:val="0"/>
-                <w:sz w:val="20"/>
-              </w:rPr>
-              <w:t>T12</w:t>
-            </w:r>
-          </w:p>
-        </w:tc>
-        <w:tc>
-          <w:tcPr>
-            <w:tcW w:type="dxa" w:w="2582"/>
-          </w:tcPr>
-          <w:p>
-            <w:pPr>
-              <w:spacing w:line="276" w:lineRule="auto" w:after="120"/>
-            </w:pPr>
-            <w:r>
-              <w:rPr>
-                <w:rFonts w:ascii="Times New Roman" w:hAnsi="Times New Roman" w:eastAsia="SimSun"/>
-                <w:b w:val="0"/>
-                <w:sz w:val="20"/>
-              </w:rPr>
-              <w:t>上传并查看照片</w:t>
-            </w:r>
-          </w:p>
-        </w:tc>
-        <w:tc>
-          <w:tcPr>
-            <w:tcW w:type="dxa" w:w="2582"/>
-          </w:tcPr>
-          <w:p>
-            <w:pPr>
-              <w:spacing w:line="276" w:lineRule="auto" w:after="120"/>
-            </w:pPr>
-            <w:r>
-              <w:rPr>
-                <w:rFonts w:ascii="Times New Roman" w:hAnsi="Times New Roman" w:eastAsia="SimSun"/>
-                <w:b w:val="0"/>
-                <w:sz w:val="20"/>
-              </w:rPr>
-              <w:t>授权人员能读取正确照片</w:t>
-            </w:r>
-          </w:p>
-        </w:tc>
-        <w:tc>
-          <w:tcPr>
-            <w:tcW w:type="dxa" w:w="2582"/>
-          </w:tcPr>
-          <w:p>
-            <w:pPr>
-              <w:spacing w:line="276" w:lineRule="auto" w:after="120"/>
-            </w:pPr>
-            <w:r>
-              <w:rPr>
-                <w:rFonts w:ascii="Times New Roman" w:hAnsi="Times New Roman" w:eastAsia="SimSun"/>
-                <w:b w:val="0"/>
-                <w:sz w:val="20"/>
-              </w:rPr>
-              <w:t>待执行／补证据</w:t>
-            </w:r>
-          </w:p>
-        </w:tc>
-      </w:tr>
     </w:tbl>
-    <w:p>
-      <w:r>
-        <w:br w:type="page"/>
-      </w:r>
-    </w:p>
-    <w:p>
-      <w:pPr>
-        <w:pStyle w:val="Heading1"/>
-      </w:pPr>
-      <w:r>
-        <w:t>附录 B——部署与使用说明</w:t>
-      </w:r>
-    </w:p>
-    <w:p>
-      <w:pPr>
-        <w:widowControl/>
-        <w:jc w:val="both"/>
-      </w:pPr>
-      <w:r>
-        <w:t>1. 使用授权 Google 账号准备库存表和私人照片文件夹，并在 Apps Script 配置其 ID 及管理员凭据。不要在报告或公开代码记录密码。</w:t>
-      </w:r>
-    </w:p>
-    <w:p>
-      <w:pPr>
-        <w:widowControl/>
-        <w:jc w:val="both"/>
-      </w:pPr>
-      <w:r>
-        <w:t>2. 保留 Products、Transactions 和 Settings 的正确字段，核实商品单位和期初库存。</w:t>
-      </w:r>
-    </w:p>
-    <w:p>
-      <w:pPr>
-        <w:widowControl/>
-        <w:jc w:val="both"/>
-      </w:pPr>
-      <w:r>
-        <w:t>3. 保存网页与后台代码后，先用测试部署检视流程；发布时更新原部署以尽量保留二维码网址。</w:t>
-      </w:r>
-    </w:p>
-    <w:p>
-      <w:pPr>
-        <w:widowControl/>
-        <w:jc w:val="both"/>
-      </w:pPr>
-      <w:r>
-        <w:t>4. 工人扫描商品二维码，核对商品，填写员工 ID、数量和照片，等成功提示后再领取。</w:t>
-      </w:r>
-    </w:p>
-    <w:p>
-      <w:pPr>
-        <w:widowControl/>
-        <w:jc w:val="both"/>
-      </w:pPr>
-      <w:r>
-        <w:t>5. 管理员检查库存、处理进货、维护资料及更正测试记录。</w:t>
-      </w:r>
-    </w:p>
-    <w:p>
-      <w:pPr>
-        <w:widowControl/>
-        <w:jc w:val="both"/>
-      </w:pPr>
-      <w:r>
-        <w:t>6. 打印前核实正式网址、已选商品和照片，先在纸上试扫一张。</w:t>
-      </w:r>
-    </w:p>
-    <w:p>
-      <w:pPr>
-        <w:widowControl/>
-        <w:jc w:val="both"/>
-      </w:pPr>
-      <w:r>
-        <w:t>7. 交接时说明共用管理员密码、照片权限、Google 配额与消息渠道限制。</w:t>
-      </w:r>
-    </w:p>
-    <w:p>
-      <w:r>
-        <w:br w:type="page"/>
-      </w:r>
-    </w:p>
-    <w:p>
-      <w:pPr>
-        <w:pStyle w:val="Heading1"/>
-      </w:pPr>
-      <w:r>
-        <w:t>附录 C——证据与待确认资料</w:t>
-      </w:r>
-    </w:p>
-    <w:p>
-      <w:pPr>
-        <w:widowControl/>
-        <w:jc w:val="both"/>
-      </w:pPr>
-      <w:r>
-        <w:t>已提供依据为 IT Plan、GD008 模板、报告指引、库存表及二维码 PDF。未提供正式会议记录、主管确认、带日期的测试截图、验收签署及完整公司资料。以下清单用于后续补齐，不代表这些证据已存在。</w:t>
-      </w:r>
-    </w:p>
-    <w:p>
-      <w:pPr>
-        <w:widowControl/>
-        <w:jc w:val="both"/>
-      </w:pPr>
-      <w:r>
-        <w:t>公司地址、业务介绍与正式组织架构：待公司确认。</w:t>
-      </w:r>
-    </w:p>
-    <w:p>
-      <w:pPr>
-        <w:widowControl/>
-        <w:jc w:val="both"/>
-      </w:pPr>
-      <w:r>
-        <w:t>公司 Logo：留空，之后插入。</w:t>
-      </w:r>
-    </w:p>
-    <w:p>
-      <w:pPr>
-        <w:widowControl/>
-        <w:jc w:val="both"/>
-      </w:pPr>
-      <w:r>
-        <w:t>会议日期、参与者及需求确认：按实际记录补充。</w:t>
-      </w:r>
-    </w:p>
-    <w:p>
-      <w:pPr>
-        <w:widowControl/>
-        <w:jc w:val="both"/>
-      </w:pPr>
-      <w:r>
-        <w:t>界面截图与扫码实测：补充获准公开的版本。</w:t>
-      </w:r>
-    </w:p>
-    <w:p>
-      <w:pPr>
-        <w:widowControl/>
-        <w:jc w:val="both"/>
-      </w:pPr>
-      <w:r>
-        <w:t>测试日期、结果及问题修复记录：实际执行后填写。</w:t>
-      </w:r>
-    </w:p>
-    <w:p>
-      <w:pPr>
-        <w:widowControl/>
-        <w:jc w:val="both"/>
-      </w:pPr>
-      <w:r>
-        <w:t>交付日期、客户或主管意见：确认后补充。</w:t>
-      </w:r>
-    </w:p>
-    <w:p>
-      <w:pPr>
-        <w:widowControl/>
-        <w:jc w:val="both"/>
-      </w:pPr>
-      <w:r>
-        <w:t>完整实习的后续项目、周记录与最终总结：后续期间完成。</w:t>
-      </w:r>
-    </w:p>
     <w:p>
       <w:r>
         <w:br w:type="page"/>
@@ -4144,11 +3107,7 @@
               </w:rPr>
               <w:t>第二周</w:t>
               <w:br/>
-              <w:t>2026 年</w:t>
-              <w:br/>
-              <w:t>10 月</w:t>
-              <w:br/>
-              <w:t>19–24 日</w:t>
+              <w:t>10/19–24</w:t>
             </w:r>
           </w:p>
         </w:tc>
@@ -4163,16 +3122,10 @@
                 <w:rFonts w:ascii="Times New Roman" w:hAnsi="Times New Roman" w:eastAsia="SimSun"/>
                 <w:sz w:val="24"/>
               </w:rPr>
-              <w:t>项目一：技术研究与初步系统设计。</w:t>
+              <w:t>截至 10 月 21 日：研究 HTML、CSS、JavaScript、Apps Script、Sheets 与 Drive，规划数据和流程，并准备初步网站原型。</w:t>
               <w:br/>
               <w:br/>
-              <w:t>截至 10 月 21 日的进展：研究使用 HTML、CSS 和 JavaScript 建立手机友好的界面，以 Google Apps Script 处理后台，Google Sheets 管理库存记录，以及 Google Drive 保存照片。</w:t>
-              <w:br/>
-              <w:br/>
-              <w:t>规划商品及交易数据字段、扫码进入对应商品、员工 ID 输入和库存计算规则，并将数量验证及管理员权限列为设计要求。</w:t>
-              <w:br/>
-              <w:br/>
-              <w:t>10 月 22–24 日计划：准备简单页面草图，与客户检视需求及流程，并确定第三周优先开发的核心功能。系统整合、详细测试与交付安排于第三、四周。</w:t>
+              <w:t>原型涵盖商品扫码、员工 ID、数量与照片、库存计算及管理功能。10 月 22–24 日拟检查和整理原型，准备第三周交客户试运行；正式反馈及修改尚待确认。</w:t>
             </w:r>
           </w:p>
         </w:tc>
@@ -4227,7 +3180,7 @@
                 <w:rFonts w:ascii="Times New Roman" w:hAnsi="Times New Roman" w:eastAsia="SimSun"/>
                 <w:sz w:val="24"/>
               </w:rPr>
-              <w:t>计划开发核心界面及 Google 服务整合，实施扫码、员工 ID、数量与照片、进出货和库存计算。完成情况及问题待实际执行后补充。</w:t>
+              <w:t>计划由客户检视及试运行，检查扫码、表单、库存与照片，收集意见并记录问题。具体修改待客户反馈。</w:t>
             </w:r>
           </w:p>
         </w:tc>
@@ -4282,7 +3235,7 @@
                 <w:rFonts w:ascii="Times New Roman" w:hAnsi="Times New Roman" w:eastAsia="SimSun"/>
                 <w:sz w:val="24"/>
               </w:rPr>
-              <w:t>计划完善管理、记录更正、品牌、标签及提醒功能，执行测试、收集反馈和准备交接。实际结果与验收待确认。</w:t>
+              <w:t>计划继续测试与初期维护，只实施与客户确认的改动并复测。实际修改与结果将在取得反馈后填写。</w:t>
             </w:r>
           </w:p>
         </w:tc>
@@ -4344,7 +3297,7 @@
                 <w:rFonts w:ascii="Times New Roman" w:hAnsi="Times New Roman" w:eastAsia="SimSun"/>
                 <w:sz w:val="24"/>
               </w:rPr>
-              <w:t>本阶段重点为客户沟通、需求分析、技术研究与流程设计。完整月总结须在月底根据实际工作更新；第三、四周计划不计作已完成成果。</w:t>
+              <w:t>前阶段完成需求、研究、设计及初步原型；后续安排客户检视、试运行、确认改动与维护。月末根据实际反馈及工作更新总结。</w:t>
             </w:r>
           </w:p>
         </w:tc>

</xml_diff>

<commit_message>
Limit report to Weeks 1 and 2 and leave later records blank
</commit_message>
<xml_diff>
--- a/docs/internship-report/GD008_Complete_Project_1_Report_Chinese_Draft.docx
+++ b/docs/internship-report/GD008_Complete_Project_1_Report_Chinese_Draft.docx
@@ -1005,7 +1005,7 @@
         <w:jc w:val="both"/>
       </w:pPr>
       <w:r>
-        <w:t>本阶段报告记录实习中的第一个项目——二维码库存管理网站。前两周集中于客户需求、技术研究、流程设计和初步原型，第三周安排客户检视及试运行，第四周按反馈进行复测与维护。具体修改待客户确认。本稿不将未来安排写为已完成成果。</w:t>
+        <w:t>本阶段报告仅记录第一个项目——二维码库存管理网站的第一、二周，期间为 2026 年 10 月 12–24 日。内容涵盖客户需求、技术研究、流程与数据设计及初步原型。原型现待客户检视，反馈与修改将在取得实际资料后补充。10 月 21 日之后的安排仍须确认。</w:t>
       </w:r>
     </w:p>
     <w:p>
@@ -1065,7 +1065,7 @@
         <w:jc w:val="both"/>
       </w:pPr>
       <w:r>
-        <w:t>表 A2：一个月进度计划</w:t>
+        <w:t>表 A2：第一、二周进度</w:t>
       </w:r>
     </w:p>
     <w:p>
@@ -1119,7 +1119,7 @@
         <w:jc w:val="both"/>
       </w:pPr>
       <w:r>
-        <w:t>实习单位为 Bakti Makmur (M) Sdn. Bhd.，实习期为 2026 年 10 月 12 日至 2027 年 1 月 9 日，企业主管为 Christopher Kong San Hor，职位 IT Technician。本部分介绍第一个项目——二维码库存管理网站，暂定安排为 2026 年 10 月 12 日至 11 月 7 日。公司背景资料及 Logo 之后补充。</w:t>
+        <w:t>实习单位为 Bakti Makmur (M) Sdn. Bhd.，实习期为 2026 年 10 月 12 日至 2027 年 1 月 9 日，企业主管为 Christopher Kong San Hor，职位 IT Technician。本部分只记录第一个项目——二维码库存管理网站的第一、二周。公司背景资料及 Logo 之后补充。</w:t>
       </w:r>
     </w:p>
     <w:p>
@@ -1265,45 +1265,6 @@
     </w:p>
     <w:p>
       <w:pPr>
-        <w:pStyle w:val="Heading2"/>
-      </w:pPr>
-      <w:r>
-        <w:t>3.3 第三周：客户检视与试运行（10 月 26–31 日，计划）</w:t>
-      </w:r>
-    </w:p>
-    <w:p>
-      <w:pPr>
-        <w:widowControl/>
-        <w:jc w:val="both"/>
-      </w:pPr>
-      <w:r>
-        <w:t>第三周安排客户检视及试用网站。试运行重点包括扫描已打印标签、进入正确商品、提交进出货、查看照片及核对库存变化。意见与问题将记录并安排优先次序；具体修改内容先保留，等待客户反馈。</w:t>
-      </w:r>
-    </w:p>
-    <w:p>
-      <w:pPr>
-        <w:pStyle w:val="Heading2"/>
-      </w:pPr>
-      <w:r>
-        <w:t>3.4 第四周：后续测试与维护（11 月 2–7 日，计划）</w:t>
-      </w:r>
-    </w:p>
-    <w:p>
-      <w:pPr>
-        <w:widowControl/>
-        <w:jc w:val="both"/>
-      </w:pPr>
-      <w:r>
-        <w:t>第四周安排继续试运行、验证与客户确认的改动，并进行初期维护。修改内容取决于实际反馈，不预先声称已修复某个问题。实际改动、复测结果与交接状态将在确认后补入。</w:t>
-      </w:r>
-    </w:p>
-    <w:p>
-      <w:r>
-        <w:br w:type="page"/>
-      </w:r>
-    </w:p>
-    <w:p>
-      <w:pPr>
         <w:pStyle w:val="Heading1"/>
       </w:pPr>
       <w:r>
@@ -1371,7 +1332,7 @@
         <w:jc w:val="both"/>
       </w:pPr>
       <w:r>
-        <w:t>研究与初步原型已为客户试运行建立基础。接下来是收集反馈、确定必要修改，并在检视日常库存记录适用性的过程中维护网站。本稿日期为 2026 年 10 月 21 日，第三、四周属于未来安排；实际意见、改动及验收之后补入。本项目只是较长实习报告中的第一部分。</w:t>
+        <w:t>第一、二周通过客户沟通、需求分析、技术研究与初步开发，建立了二维码库存网站的原型，目前待客户检视。实际反馈、修改与维护将在取得资料后另外记录。本部分仅涵盖前两周，作为较长实习报告的开端。</w:t>
       </w:r>
     </w:p>
     <w:p>
@@ -1919,7 +1880,7 @@
         <w:pStyle w:val="Heading2"/>
       </w:pPr>
       <w:r>
-        <w:t>表 A2：一个月进度计划</w:t>
+        <w:t>表 A2：第一、二周进度</w:t>
       </w:r>
     </w:p>
     <w:tbl>
@@ -2100,118 +2061,6 @@
                 <w:sz w:val="20"/>
               </w:rPr>
               <w:t>研究、设计与初步原型</w:t>
-            </w:r>
-          </w:p>
-        </w:tc>
-      </w:tr>
-      <w:tr>
-        <w:tc>
-          <w:tcPr>
-            <w:tcW w:type="dxa" w:w="3443"/>
-          </w:tcPr>
-          <w:p>
-            <w:pPr>
-              <w:spacing w:line="276" w:lineRule="auto" w:after="120"/>
-            </w:pPr>
-            <w:r>
-              <w:rPr>
-                <w:rFonts w:ascii="Times New Roman" w:hAnsi="Times New Roman" w:eastAsia="SimSun"/>
-                <w:b w:val="0"/>
-                <w:sz w:val="20"/>
-              </w:rPr>
-              <w:t>第三周（计划）</w:t>
-            </w:r>
-          </w:p>
-        </w:tc>
-        <w:tc>
-          <w:tcPr>
-            <w:tcW w:type="dxa" w:w="3443"/>
-          </w:tcPr>
-          <w:p>
-            <w:pPr>
-              <w:spacing w:line="276" w:lineRule="auto" w:after="120"/>
-            </w:pPr>
-            <w:r>
-              <w:rPr>
-                <w:rFonts w:ascii="Times New Roman" w:hAnsi="Times New Roman" w:eastAsia="SimSun"/>
-                <w:b w:val="0"/>
-                <w:sz w:val="20"/>
-              </w:rPr>
-              <w:t>2026/10/26–31</w:t>
-            </w:r>
-          </w:p>
-        </w:tc>
-        <w:tc>
-          <w:tcPr>
-            <w:tcW w:type="dxa" w:w="3443"/>
-          </w:tcPr>
-          <w:p>
-            <w:pPr>
-              <w:spacing w:line="276" w:lineRule="auto" w:after="120"/>
-            </w:pPr>
-            <w:r>
-              <w:rPr>
-                <w:rFonts w:ascii="Times New Roman" w:hAnsi="Times New Roman" w:eastAsia="SimSun"/>
-                <w:b w:val="0"/>
-                <w:sz w:val="20"/>
-              </w:rPr>
-              <w:t>客户检视、试运行与反馈；修改待确认</w:t>
-            </w:r>
-          </w:p>
-        </w:tc>
-      </w:tr>
-      <w:tr>
-        <w:tc>
-          <w:tcPr>
-            <w:tcW w:type="dxa" w:w="3443"/>
-          </w:tcPr>
-          <w:p>
-            <w:pPr>
-              <w:spacing w:line="276" w:lineRule="auto" w:after="120"/>
-            </w:pPr>
-            <w:r>
-              <w:rPr>
-                <w:rFonts w:ascii="Times New Roman" w:hAnsi="Times New Roman" w:eastAsia="SimSun"/>
-                <w:b w:val="0"/>
-                <w:sz w:val="20"/>
-              </w:rPr>
-              <w:t>第四周（计划）</w:t>
-            </w:r>
-          </w:p>
-        </w:tc>
-        <w:tc>
-          <w:tcPr>
-            <w:tcW w:type="dxa" w:w="3443"/>
-          </w:tcPr>
-          <w:p>
-            <w:pPr>
-              <w:spacing w:line="276" w:lineRule="auto" w:after="120"/>
-            </w:pPr>
-            <w:r>
-              <w:rPr>
-                <w:rFonts w:ascii="Times New Roman" w:hAnsi="Times New Roman" w:eastAsia="SimSun"/>
-                <w:b w:val="0"/>
-                <w:sz w:val="20"/>
-              </w:rPr>
-              <w:t>2026/11/2–7</w:t>
-            </w:r>
-          </w:p>
-        </w:tc>
-        <w:tc>
-          <w:tcPr>
-            <w:tcW w:type="dxa" w:w="3443"/>
-          </w:tcPr>
-          <w:p>
-            <w:pPr>
-              <w:spacing w:line="276" w:lineRule="auto" w:after="120"/>
-            </w:pPr>
-            <w:r>
-              <w:rPr>
-                <w:rFonts w:ascii="Times New Roman" w:hAnsi="Times New Roman" w:eastAsia="SimSun"/>
-                <w:b w:val="0"/>
-                <w:sz w:val="20"/>
-              </w:rPr>
-              <w:t>按客户反馈复测与维护</w:t>
             </w:r>
           </w:p>
         </w:tc>
@@ -2778,7 +2627,7 @@
         <w:jc w:val="both"/>
       </w:pPr>
       <w:r>
-        <w:t>第一、二周为当前记录草稿；第三、四周为项目计划，不作为已完成工作或出勤证明。</w:t>
+        <w:t>仅填写第一、二周。其余周次与月份总结留空，之后按实际情况补充。</w:t>
       </w:r>
     </w:p>
     <w:tbl>
@@ -3114,18 +2963,11 @@
         <w:tc>
           <w:tcPr/>
           <w:p>
-            <w:pPr>
-              <w:spacing w:line="360" w:lineRule="auto"/>
-            </w:pPr>
-            <w:r>
-              <w:rPr>
-                <w:rFonts w:ascii="Times New Roman" w:hAnsi="Times New Roman" w:eastAsia="SimSun"/>
-                <w:sz w:val="24"/>
-              </w:rPr>
+            <w:r>
               <w:t>截至 10 月 21 日：研究 HTML、CSS、JavaScript、Apps Script、Sheets 与 Drive，规划数据和流程，并准备初步网站原型。</w:t>
               <w:br/>
               <w:br/>
-              <w:t>原型涵盖商品扫码、员工 ID、数量与照片、库存计算及管理功能。10 月 22–24 日拟检查和整理原型，准备第三周交客户试运行；正式反馈及修改尚待确认。</w:t>
+              <w:t>原型涵盖商品扫码、员工 ID、数量与照片、库存计算及管理功能。10 月 22–24 日拟检查和整理原型，准备交客户检视；正式反馈及修改尚待确认。</w:t>
             </w:r>
           </w:p>
         </w:tc>
@@ -3153,49 +2995,19 @@
         <w:tc>
           <w:tcPr/>
           <w:p>
-            <w:pPr>
-              <w:spacing w:line="360" w:lineRule="auto"/>
-            </w:pPr>
-            <w:r>
-              <w:rPr>
-                <w:rFonts w:ascii="Times New Roman" w:hAnsi="Times New Roman" w:eastAsia="SimSun"/>
-                <w:sz w:val="24"/>
-              </w:rPr>
-              <w:t>第三周</w:t>
-              <w:br/>
-              <w:t>10/26–31</w:t>
-              <w:br/>
-              <w:t>（计划）</w:t>
-            </w:r>
+            <w:r/>
           </w:p>
         </w:tc>
         <w:tc>
           <w:tcPr/>
           <w:p>
-            <w:pPr>
-              <w:spacing w:line="360" w:lineRule="auto"/>
-            </w:pPr>
-            <w:r>
-              <w:rPr>
-                <w:rFonts w:ascii="Times New Roman" w:hAnsi="Times New Roman" w:eastAsia="SimSun"/>
-                <w:sz w:val="24"/>
-              </w:rPr>
-              <w:t>计划由客户检视及试运行，检查扫码、表单、库存与照片，收集意见并记录问题。具体修改待客户反馈。</w:t>
-            </w:r>
+            <w:r/>
           </w:p>
         </w:tc>
         <w:tc>
           <w:tcPr/>
           <w:p>
-            <w:pPr>
-              <w:spacing w:line="360" w:lineRule="auto"/>
-            </w:pPr>
-            <w:r>
-              <w:rPr>
-                <w:rFonts w:ascii="Times New Roman" w:hAnsi="Times New Roman" w:eastAsia="SimSun"/>
-                <w:sz w:val="24"/>
-              </w:rPr>
-            </w:r>
+            <w:r/>
           </w:p>
         </w:tc>
       </w:tr>
@@ -3208,49 +3020,19 @@
         <w:tc>
           <w:tcPr/>
           <w:p>
-            <w:pPr>
-              <w:spacing w:line="360" w:lineRule="auto"/>
-            </w:pPr>
-            <w:r>
-              <w:rPr>
-                <w:rFonts w:ascii="Times New Roman" w:hAnsi="Times New Roman" w:eastAsia="SimSun"/>
-                <w:sz w:val="24"/>
-              </w:rPr>
-              <w:t>第四周</w:t>
-              <w:br/>
-              <w:t>11/2–7</w:t>
-              <w:br/>
-              <w:t>（计划）</w:t>
-            </w:r>
+            <w:r/>
           </w:p>
         </w:tc>
         <w:tc>
           <w:tcPr/>
           <w:p>
-            <w:pPr>
-              <w:spacing w:line="360" w:lineRule="auto"/>
-            </w:pPr>
-            <w:r>
-              <w:rPr>
-                <w:rFonts w:ascii="Times New Roman" w:hAnsi="Times New Roman" w:eastAsia="SimSun"/>
-                <w:sz w:val="24"/>
-              </w:rPr>
-              <w:t>计划继续测试与初期维护，只实施与客户确认的改动并复测。实际修改与结果将在取得反馈后填写。</w:t>
-            </w:r>
+            <w:r/>
           </w:p>
         </w:tc>
         <w:tc>
           <w:tcPr/>
           <w:p>
-            <w:pPr>
-              <w:spacing w:line="360" w:lineRule="auto"/>
-            </w:pPr>
-            <w:r>
-              <w:rPr>
-                <w:rFonts w:ascii="Times New Roman" w:hAnsi="Times New Roman" w:eastAsia="SimSun"/>
-                <w:sz w:val="24"/>
-              </w:rPr>
-            </w:r>
+            <w:r/>
           </w:p>
         </w:tc>
       </w:tr>
@@ -3265,15 +3047,8 @@
             <w:gridSpan w:val="3"/>
           </w:tcPr>
           <w:p>
-            <w:pPr>
-              <w:spacing w:line="360" w:lineRule="auto"/>
-            </w:pPr>
-            <w:r>
-              <w:rPr>
-                <w:rFonts w:ascii="Times New Roman" w:hAnsi="Times New Roman" w:eastAsia="SimSun"/>
-                <w:sz w:val="24"/>
-              </w:rPr>
-              <w:t>月份总结：2026 年 10 月（截至 21 日的阶段性草稿）</w:t>
+            <w:r>
+              <w:t>月份总结：2026 年 10 月</w:t>
             </w:r>
           </w:p>
         </w:tc>
@@ -3289,16 +3064,7 @@
             <w:gridSpan w:val="3"/>
           </w:tcPr>
           <w:p>
-            <w:pPr>
-              <w:spacing w:line="360" w:lineRule="auto"/>
-            </w:pPr>
-            <w:r>
-              <w:rPr>
-                <w:rFonts w:ascii="Times New Roman" w:hAnsi="Times New Roman" w:eastAsia="SimSun"/>
-                <w:sz w:val="24"/>
-              </w:rPr>
-              <w:t>前阶段完成需求、研究、设计及初步原型；后续安排客户检视、试运行、确认改动与维护。月末根据实际反馈及工作更新总结。</w:t>
-            </w:r>
+            <w:r/>
           </w:p>
         </w:tc>
       </w:tr>

</xml_diff>

<commit_message>
Expand matching bilingual reports into detailed daily entries for 12-25 October
</commit_message>
<xml_diff>
--- a/docs/internship-report/GD008_Complete_Project_1_Report_Chinese_Draft.docx
+++ b/docs/internship-report/GD008_Complete_Project_1_Report_Chinese_Draft.docx
@@ -1005,7 +1005,7 @@
         <w:jc w:val="both"/>
       </w:pPr>
       <w:r>
-        <w:t>本阶段报告仅记录第一个项目——二维码库存管理网站的第一、二周，期间为 2026 年 10 月 12–24 日。内容涵盖客户需求、技术研究、流程与数据设计及初步原型。原型现待客户检视，反馈与修改将在取得实际资料后补充。10 月 21 日之后的安排仍须确认。</w:t>
+        <w:t>本阶段报告涵盖 2026 年 10 月 12–25 日，即第一个项目——二维码库存管理网站的前两个报告周。将上一版相同的需求、研究、流程与数据设计及初步原型内容扩写为逐日记录。原型待客户检视；具体每日分配须核实，21 日之后仍属计划，不将后续反馈、修改与维护写为已完成工作。</w:t>
       </w:r>
     </w:p>
     <w:p>
@@ -1031,7 +1031,7 @@
       </w:r>
     </w:p>
     <w:p>
-      <w:fldSimple w:instr="TOC \o &quot;1-2&quot; \h \z \u">
+      <w:fldSimple w:instr="TOC \o &quot;1-3&quot; \h \z \u">
         <w:r>
           <w:t>在 Word 中右键更新目录。</w:t>
         </w:r>
@@ -1065,7 +1065,7 @@
         <w:jc w:val="both"/>
       </w:pPr>
       <w:r>
-        <w:t>表 A2：第一、二周进度</w:t>
+        <w:t>表 A2：第一、二周进度（10 月 12–25 日）</w:t>
       </w:r>
     </w:p>
     <w:p>
@@ -1191,6 +1191,14 @@
     </w:p>
     <w:p>
       <w:pPr>
+        <w:jc w:val="both"/>
+      </w:pPr>
+      <w:r>
+        <w:t>从技术职责看，HTML 定义商品选择、输入字段及管理表格；CSS 提供手机布局和打印样式；JavaScript 负责交互、输入准备和二维码生成。Apps Script 在后台核对请求并连接表格与文件，避免让工人直接修改库存表。工具分工围绕相同需求展开，没有增加新的项目范围。</w:t>
+      </w:r>
+    </w:p>
+    <w:p>
+      <w:pPr>
         <w:pStyle w:val="Heading2"/>
       </w:pPr>
       <w:r>
@@ -1231,41 +1239,418 @@
     </w:p>
     <w:p>
       <w:pPr>
+        <w:widowControl/>
+        <w:spacing w:line="360" w:lineRule="auto" w:after="200"/>
+        <w:jc w:val="both"/>
+      </w:pPr>
+      <w:r>
+        <w:t>逐日编排说明：本节将上一版相同的活动扩写并按日期暂分配，并非已经核实的逐日出勤日志。12–21 日的具体任务日期须按实际记录确认；22–25 日为未来安排。线上与线下沟通确属原需求，但具体会议日期尚未提供。星期日是否工作待确认，后续客户反馈、修改及维护不预先编写。</w:t>
+      </w:r>
+    </w:p>
+    <w:p>
+      <w:pPr>
         <w:pStyle w:val="Heading2"/>
       </w:pPr>
       <w:r>
-        <w:t>3.1 第一周：需求与流程理解（10 月 12–17 日）</w:t>
+        <w:t>3.1 第一周：2026 年 10 月 12–18 日</w:t>
       </w:r>
     </w:p>
     <w:p>
       <w:pPr>
+        <w:pStyle w:val="Heading3"/>
+      </w:pPr>
+      <w:r>
+        <w:t>2026 年 10 月 12 日（星期一）——项目了解与现有记录查阅</w:t>
+      </w:r>
+    </w:p>
+    <w:p>
+      <w:pPr>
         <w:widowControl/>
+        <w:spacing w:line="360" w:lineRule="auto" w:after="200"/>
         <w:jc w:val="both"/>
       </w:pPr>
       <w:r>
-        <w:t>我通过线上沟通和线下会议了解工人领货及管理员检查库存的方式，查阅现有库存资料和扫码进入表单的流程，识别所需字段并整理初步需求。我也拟定工人与管理员流程，并探索可行的网站方案。</w:t>
+        <w:t>我先了解库存网站项目的用途，并查阅客户提供的资料。库存电子表格列出了需要保留的商品编号、名称、单位与数量。我也查看原有 Google Form 入口，以及包含个别二维码和商品图片的 PDF。这帮助我认识到，网站应改善现有记录流程，而不是另建一个与原操作无关的应用。</w:t>
       </w:r>
     </w:p>
     <w:p>
       <w:pPr>
+        <w:widowControl/>
+        <w:spacing w:line="360" w:lineRule="auto" w:after="200"/>
+        <w:ind w:firstLine="720"/>
+        <w:jc w:val="both"/>
+      </w:pPr>
+      <w:r>
+        <w:t>主要任务是理解起点流程：工人扫描标签后记录一次库存操作。我整理了需要澄清的问题，尤其是进货与领货的区别、每次操作需要的凭证，以及谁可以看到库存数量。当天内容的预期产出是用于需求沟通的初步问题清单。</w:t>
+      </w:r>
+    </w:p>
+    <w:p>
+      <w:pPr>
+        <w:pStyle w:val="Heading3"/>
+      </w:pPr>
+      <w:r>
+        <w:t>2026 年 10 月 13 日（星期二）——线上客户沟通与初步需求</w:t>
+      </w:r>
+    </w:p>
+    <w:p>
+      <w:pPr>
+        <w:widowControl/>
+        <w:spacing w:line="360" w:lineRule="auto" w:after="200"/>
+        <w:jc w:val="both"/>
+      </w:pPr>
+      <w:r>
+        <w:t>我通过线上沟通厘清预期操作方式，重点包括工人如何进入商品表单、应填写什么资料，以及提交后库存如何变化。主要记录字段确定为员工识别资料、操作数量及照片，必要时也可以填写备注。</w:t>
+      </w:r>
+    </w:p>
+    <w:p>
+      <w:pPr>
+        <w:widowControl/>
+        <w:spacing w:line="360" w:lineRule="auto" w:after="200"/>
+        <w:ind w:firstLine="720"/>
+        <w:jc w:val="both"/>
+      </w:pPr>
+      <w:r>
+        <w:t>我把客户期望的结果与实施方法分开。例如，“库存自动减少”需要定义清楚的领货交易和一致的计算规则。我将这些内容整理为初步需求清单，让实际操作描述可以成为设计依据。此项沟通的具体日期仍须以学生实际会议记录核对。</w:t>
+      </w:r>
+    </w:p>
+    <w:p>
+      <w:pPr>
+        <w:pStyle w:val="Heading3"/>
+      </w:pPr>
+      <w:r>
+        <w:t>2026 年 10 月 14 日（星期三）——线下讨论与流程澄清</w:t>
+      </w:r>
+    </w:p>
+    <w:p>
+      <w:pPr>
+        <w:widowControl/>
+        <w:spacing w:line="360" w:lineRule="auto" w:after="200"/>
+        <w:jc w:val="both"/>
+      </w:pPr>
+      <w:r>
+        <w:t>线下讨论用于了解拟议系统如何配合领货操作。重要要求是工人扫码后能看到名称、图片及单位，但实际库存只让管理员查看。进货也应通过管理员授权登记，不作为一般工人的操作。</w:t>
+      </w:r>
+    </w:p>
+    <w:p>
+      <w:pPr>
+        <w:widowControl/>
+        <w:spacing w:line="360" w:lineRule="auto" w:after="200"/>
+        <w:ind w:firstLine="720"/>
+        <w:jc w:val="both"/>
+      </w:pPr>
+      <w:r>
+        <w:t>我考虑 PAIR、PCS、PACK 和 KG 等单位的实际意义，数量输入必须配合该商品的单位，避免把一包误当成一件。我也记录商品编号应保持固定，因为已打印二维码使用这个编号。会议细节和日期须根据学生实际记录确认。</w:t>
+      </w:r>
+    </w:p>
+    <w:p>
+      <w:pPr>
+        <w:pStyle w:val="Heading3"/>
+      </w:pPr>
+      <w:r>
+        <w:t>2026 年 10 月 15 日（星期四）——需求清单整理</w:t>
+      </w:r>
+    </w:p>
+    <w:p>
+      <w:pPr>
+        <w:widowControl/>
+        <w:spacing w:line="360" w:lineRule="auto" w:after="200"/>
+        <w:jc w:val="both"/>
+      </w:pPr>
+      <w:r>
+        <w:t>我把需求分成工人、管理员与系统责任。工人部分包括扫描对应商品、查看资料、填写员工 ID、数量及照片；管理员部分包括查看库存、登记进货、维护商品、更正错误记录、设置警戒值及打印标签。公司名称与 Logo 设置也归入相同的管理范围。</w:t>
+      </w:r>
+    </w:p>
+    <w:p>
+      <w:pPr>
+        <w:widowControl/>
+        <w:spacing w:line="360" w:lineRule="auto" w:after="200"/>
+        <w:ind w:firstLine="720"/>
+        <w:jc w:val="both"/>
+      </w:pPr>
+      <w:r>
+        <w:t>我区分必要行为与后续增强功能。首阶段以已配置的邮件和网页提醒为主，其他消息渠道不纳入当前范围，以避免需求不断扩大。产出是可供客户检视的清单，不将其当成已验收或已完成测试的证明。</w:t>
+      </w:r>
+    </w:p>
+    <w:p>
+      <w:pPr>
+        <w:pStyle w:val="Heading3"/>
+      </w:pPr>
+      <w:r>
+        <w:t>2026 年 10 月 16 日（星期五）——开发方案研究</w:t>
+      </w:r>
+    </w:p>
+    <w:p>
+      <w:pPr>
+        <w:widowControl/>
+        <w:spacing w:line="360" w:lineRule="auto" w:after="200"/>
+        <w:jc w:val="both"/>
+      </w:pPr>
+      <w:r>
+        <w:t>我比较手机友好的网站与原生应用。网站适合现有流程，因为手机相机扫码后便能直接打开商品链接，无须另行安装，管理员也可以使用电脑。我研究 HTML、CSS 与 JavaScript 如何构成表单及响应式界面。</w:t>
+      </w:r>
+    </w:p>
+    <w:p>
+      <w:pPr>
+        <w:widowControl/>
+        <w:spacing w:line="360" w:lineRule="auto" w:after="200"/>
+        <w:ind w:firstLine="720"/>
+        <w:jc w:val="both"/>
+      </w:pPr>
+      <w:r>
+        <w:t>我也研究 Google Apps Script 作为连接 Sheets 和 Drive 的后台。Sheets 可以保存商品及操作记录，Drive 保存照片。这配合已有 Google 工具，减少初始架构工作。我同时记录网络依赖、服务配额，以及不能只靠隐藏按钮、必须由后台检查权限等限制。</w:t>
+      </w:r>
+    </w:p>
+    <w:p>
+      <w:pPr>
+        <w:pStyle w:val="Heading3"/>
+      </w:pPr>
+      <w:r>
+        <w:t>2026 年 10 月 17 日（星期六）——初步流程与数据字段规划</w:t>
+      </w:r>
+    </w:p>
+    <w:p>
+      <w:pPr>
+        <w:widowControl/>
+        <w:spacing w:line="360" w:lineRule="auto" w:after="200"/>
+        <w:jc w:val="both"/>
+      </w:pPr>
+      <w:r>
+        <w:t>我将工人流程整理为扫码、核对商品、输入员工 ID 和数量、附照片及提交。管理员流程涵盖检查库存、进货、修改商品及标签打印。分开描述两类流程，有助于辨认需要管理权限的操作。</w:t>
+      </w:r>
+    </w:p>
+    <w:p>
+      <w:pPr>
+        <w:widowControl/>
+        <w:spacing w:line="360" w:lineRule="auto" w:after="200"/>
+        <w:ind w:firstLine="720"/>
+        <w:jc w:val="both"/>
+      </w:pPr>
+      <w:r>
+        <w:t>我规划分开保存商品与交易。商品包括编号、名称、单位、期初库存、警戒值和图片引用；交易包括对应商品、进出类型、数量、员工 ID、时间及照片引用。计算规则为期初库存加有效进货，再减有效领货。这为初步原型建立基础。星期六的任务归属仍须核对实际出勤。</w:t>
+      </w:r>
+    </w:p>
+    <w:p>
+      <w:pPr>
+        <w:pStyle w:val="Heading3"/>
+      </w:pPr>
+      <w:r>
+        <w:t>2026 年 10 月 18 日（星期日）——活动记录待确认</w:t>
+      </w:r>
+    </w:p>
+    <w:p>
+      <w:pPr>
+        <w:widowControl/>
+        <w:spacing w:line="360" w:lineRule="auto" w:after="200"/>
+        <w:jc w:val="both"/>
+      </w:pPr>
+      <w:r>
+        <w:t>目前没有提供这个星期日的实际工作或出勤资料，因此不声称当天进行了会议、开发或特定工时。如实际为休息日，应按实记录；如确有项目工作，则在提交前补入实际任务与结果。</w:t>
+      </w:r>
+    </w:p>
+    <w:p>
+      <w:pPr>
         <w:pStyle w:val="Heading2"/>
       </w:pPr>
       <w:r>
-        <w:t>3.2 第二周：研究、设计与初步开发（10 月 19–24 日）</w:t>
+        <w:t>3.2 第二周：2026 年 10 月 19–25 日</w:t>
       </w:r>
     </w:p>
     <w:p>
       <w:pPr>
+        <w:pStyle w:val="Heading3"/>
+      </w:pPr>
+      <w:r>
+        <w:t>2026 年 10 月 19 日（星期一）——数据组织与原型结构</w:t>
+      </w:r>
+    </w:p>
+    <w:p>
+      <w:pPr>
         <w:widowControl/>
+        <w:spacing w:line="360" w:lineRule="auto" w:after="200"/>
         <w:jc w:val="both"/>
       </w:pPr>
       <w:r>
-        <w:t>截至 10 月 21 日，工作集中于工具选择、商品与交易数据设计，以及初步网站开发。原型整合了二维码商品选择、员工 ID、数量、照片、库存计算及管理员功能。本周其余时间安排检查原型并准备交给客户检视。正式验收及客户要求的修改仍待确认。</w:t>
+        <w:t>我完善 Products、Transactions 和 Settings 的数据组织。商品资料与库存交易分开，便于追踪变化；Settings 用于公司名称及 Logo。数据模型也区分商品展示图片与每一笔操作的现场照片。</w:t>
       </w:r>
     </w:p>
     <w:p>
       <w:pPr>
+        <w:widowControl/>
+        <w:spacing w:line="360" w:lineRule="auto" w:after="200"/>
+        <w:ind w:firstLine="720"/>
+        <w:jc w:val="both"/>
+      </w:pPr>
+      <w:r>
+        <w:t>页面结构分为工人表单、管理员库存页及二维码标签页，使用相同商品编号连接库存记录、表单和标签。期初库存视为需要盘点核实的起点，不用它代替正常进货。产出是更清楚的界面与记录连接方式。</w:t>
+      </w:r>
+    </w:p>
+    <w:p>
+      <w:pPr>
+        <w:pStyle w:val="Heading3"/>
+      </w:pPr>
+      <w:r>
+        <w:t>2026 年 10 月 20 日（星期二）——工人界面与提交流程</w:t>
+      </w:r>
+    </w:p>
+    <w:p>
+      <w:pPr>
+        <w:widowControl/>
+        <w:spacing w:line="360" w:lineRule="auto" w:after="200"/>
+        <w:jc w:val="both"/>
+      </w:pPr>
+      <w:r>
+        <w:t>我使用 HTML、CSS 和 JavaScript 建立初步工人界面。表单显示所选商品，接收员工 ID 和数量，并要求照片。由于扫码是主要入口，布局需要在手机上保持易读。</w:t>
+      </w:r>
+    </w:p>
+    <w:p>
+      <w:pPr>
+        <w:widowControl/>
+        <w:spacing w:line="360" w:lineRule="auto" w:after="200"/>
+        <w:ind w:firstLine="720"/>
+        <w:jc w:val="both"/>
+      </w:pPr>
+      <w:r>
+        <w:t>我考虑提交后的处理步骤：验证输入、识别商品、区分进货和领货，以及保存照片引用。设计包括正数数量、库存不足拦截及重复请求处理。员工 ID 作为文字保留，以支持字母和开头的 0，但不将填写 ID 视为已核实身份。</w:t>
+      </w:r>
+    </w:p>
+    <w:p>
+      <w:pPr>
+        <w:pStyle w:val="Heading3"/>
+      </w:pPr>
+      <w:r>
+        <w:t>2026 年 10 月 21 日（星期三）——初步管理功能与审阅准备</w:t>
+      </w:r>
+    </w:p>
+    <w:p>
+      <w:pPr>
+        <w:widowControl/>
+        <w:spacing w:line="360" w:lineRule="auto" w:after="200"/>
+        <w:jc w:val="both"/>
+      </w:pPr>
+      <w:r>
+        <w:t>我将管理员需求整合到初步原型，包括库存与近期记录、商品维护、警戒值、照片更新及商品二维码生成。标签选择需要支持单件、多件或全部，并能在打印前移除误选项。</w:t>
+      </w:r>
+    </w:p>
+    <w:p>
+      <w:pPr>
+        <w:widowControl/>
+        <w:spacing w:line="360" w:lineRule="auto" w:after="200"/>
+        <w:ind w:firstLine="720"/>
+        <w:jc w:val="both"/>
+      </w:pPr>
+      <w:r>
+        <w:t>我也考虑如何受控地更正错误库存记录：只撤销一次库存影响，保留原始记录与原因；删除进货不能造成负库存。研究、设计及初步原型已准备供客户检视，但客户验收和具体修改仍待反馈，不能混同为已完成交付。</w:t>
+      </w:r>
+    </w:p>
+    <w:p>
+      <w:pPr>
+        <w:pStyle w:val="Heading3"/>
+      </w:pPr>
+      <w:r>
+        <w:t>2026 年 10 月 22 日（星期四）——计划检查原型与资料</w:t>
+      </w:r>
+    </w:p>
+    <w:p>
+      <w:pPr>
+        <w:widowControl/>
+        <w:spacing w:line="360" w:lineRule="auto" w:after="200"/>
+        <w:jc w:val="both"/>
+      </w:pPr>
+      <w:r>
+        <w:t>计划内容：根据现有需求清单检查原型，重点核对商品编号、单位、员工 ID、数量和照片字段；检查工人页面不显示库存，进货操作需要管理员授权。</w:t>
+      </w:r>
+    </w:p>
+    <w:p>
+      <w:pPr>
+        <w:widowControl/>
+        <w:spacing w:line="360" w:lineRule="auto" w:after="200"/>
+        <w:ind w:firstLine="720"/>
+        <w:jc w:val="both"/>
+      </w:pPr>
+      <w:r>
+        <w:t>预期产出是客户审阅前需要澄清的差异或遗漏清单。不预先声称发现了特定故障、完成修复或通过测试，实际检查内容及结果应在执行后替换这项计划。</w:t>
+      </w:r>
+    </w:p>
+    <w:p>
+      <w:pPr>
+        <w:pStyle w:val="Heading3"/>
+      </w:pPr>
+      <w:r>
+        <w:t>2026 年 10 月 23 日（星期五）——计划检视标签与管理界面</w:t>
+      </w:r>
+    </w:p>
+    <w:p>
+      <w:pPr>
+        <w:widowControl/>
+        <w:spacing w:line="360" w:lineRule="auto" w:after="200"/>
+        <w:jc w:val="both"/>
+      </w:pPr>
+      <w:r>
+        <w:t>计划内容：检视商品二维码链接和标签排版，包括编号、名称、单位、可用照片和可选文字；检查已选清单清楚显示打印对象，移除选项不会删除商品。</w:t>
+      </w:r>
+    </w:p>
+    <w:p>
+      <w:pPr>
+        <w:widowControl/>
+        <w:spacing w:line="360" w:lineRule="auto" w:after="200"/>
+        <w:ind w:firstLine="720"/>
+        <w:jc w:val="both"/>
+      </w:pPr>
+      <w:r>
+        <w:t>管理界面检视拟包括已在需求内的公司名称与 Logo、商品资料及记录更正控制。这是现有范围内的准备，不新增功能承诺。实际发现的问题及结果待执行后记录。</w:t>
+      </w:r>
+    </w:p>
+    <w:p>
+      <w:pPr>
+        <w:pStyle w:val="Heading3"/>
+      </w:pPr>
+      <w:r>
+        <w:t>2026 年 10 月 24 日（星期六）——计划整理客户审阅材料</w:t>
+      </w:r>
+    </w:p>
+    <w:p>
+      <w:pPr>
+        <w:widowControl/>
+        <w:spacing w:line="360" w:lineRule="auto" w:after="200"/>
+        <w:jc w:val="both"/>
+      </w:pPr>
+      <w:r>
+        <w:t>计划内容：整理初步需求、流程说明和原型，让客户能够一起检视；准备可供确认功能、要求修改或填写意见的客户需求表，并保持预期行为与报告一致。</w:t>
+      </w:r>
+    </w:p>
+    <w:p>
+      <w:pPr>
+        <w:widowControl/>
+        <w:spacing w:line="360" w:lineRule="auto" w:after="200"/>
+        <w:ind w:firstLine="720"/>
+        <w:jc w:val="both"/>
+      </w:pPr>
+      <w:r>
+        <w:t>预期阶段成果是准备好接受反馈的原型，不假定已取得最终验收。由于尚未收到反馈，具体修改及维护不预先编写。这个星期六是否工作及实际完成了哪些准备，都需要之后确认。</w:t>
+      </w:r>
+    </w:p>
+    <w:p>
+      <w:pPr>
+        <w:pStyle w:val="Heading3"/>
+      </w:pPr>
+      <w:r>
+        <w:t>2026 年 10 月 25 日（星期日）——工作安排待确认</w:t>
+      </w:r>
+    </w:p>
+    <w:p>
+      <w:pPr>
+        <w:widowControl/>
+        <w:spacing w:line="360" w:lineRule="auto" w:after="200"/>
+        <w:jc w:val="both"/>
+      </w:pPr>
+      <w:r>
+        <w:t>保留此日期是为了覆盖要求的 10 月 12–25 日，但不假定当天有工作；相对本稿日期，这也是未来日期。如实际休息，按休息日记录；如有项目工作，之后补入核实内容。不声称当天已完成客户检视、测试、修改或维护。</w:t>
+      </w:r>
+    </w:p>
+    <w:p>
+      <w:pPr>
         <w:pStyle w:val="Heading1"/>
+        <w:pageBreakBefore/>
       </w:pPr>
       <w:r>
         <w:t>第四章——工作任务与专业实践</w:t>
@@ -1303,6 +1688,14 @@
       </w:pPr>
       <w:r>
         <w:t>正式使用前须核实期初库存，清楚标识测试记录，并在更正时保留核查资料。密码与私人照片链接不应公开。项目促进软件设计及工具应用能力（CO1–CO2）、沟通与自主学习（CO5–CO7），以及负责任地处理客户资料（CO3–CO4）。</w:t>
+      </w:r>
+    </w:p>
+    <w:p>
+      <w:pPr>
+        <w:jc w:val="both"/>
+      </w:pPr>
+      <w:r>
+        <w:t>本阶段的主要困难是把日常操作描述转化为明确规则，例如数量使用哪个单位、哪些信息需要隐藏、记录填错后如何更正。我以分类需求、分开工人与管理员流程，以及明确数据字段的方式处理。这加强了沟通、独立研究和问题拆解能力；客户意见尚待收集，因此不虚构具体修改结果。</w:t>
       </w:r>
     </w:p>
     <w:p>
@@ -1880,7 +2273,7 @@
         <w:pStyle w:val="Heading2"/>
       </w:pPr>
       <w:r>
-        <w:t>表 A2：第一、二周进度</w:t>
+        <w:t>表 A2：第一、二周进度（10 月 12–25 日）</w:t>
       </w:r>
     </w:p>
     <w:tbl>
@@ -1977,16 +2370,8 @@
             <w:tcW w:type="dxa" w:w="3443"/>
           </w:tcPr>
           <w:p>
-            <w:pPr>
-              <w:spacing w:line="276" w:lineRule="auto" w:after="120"/>
-            </w:pPr>
-            <w:r>
-              <w:rPr>
-                <w:rFonts w:ascii="Times New Roman" w:hAnsi="Times New Roman" w:eastAsia="SimSun"/>
-                <w:b w:val="0"/>
-                <w:sz w:val="20"/>
-              </w:rPr>
-              <w:t>2026/10/12–17</w:t>
+            <w:r>
+              <w:t>2026/10/12–18</w:t>
             </w:r>
           </w:p>
         </w:tc>
@@ -2033,16 +2418,8 @@
             <w:tcW w:type="dxa" w:w="3443"/>
           </w:tcPr>
           <w:p>
-            <w:pPr>
-              <w:spacing w:line="276" w:lineRule="auto" w:after="120"/>
-            </w:pPr>
-            <w:r>
-              <w:rPr>
-                <w:rFonts w:ascii="Times New Roman" w:hAnsi="Times New Roman" w:eastAsia="SimSun"/>
-                <w:b w:val="0"/>
-                <w:sz w:val="20"/>
-              </w:rPr>
-              <w:t>2026/10/19–24</w:t>
+            <w:r>
+              <w:t>2026/10/19–25</w:t>
             </w:r>
           </w:p>
         </w:tc>
@@ -2890,11 +3267,7 @@
               </w:rPr>
               <w:t>第一周</w:t>
               <w:br/>
-              <w:t>2026 年</w:t>
-              <w:br/>
-              <w:t>10 月</w:t>
-              <w:br/>
-              <w:t>12–17 日</w:t>
+              <w:t>10/12–18</w:t>
             </w:r>
           </w:p>
         </w:tc>
@@ -2909,16 +3282,25 @@
                 <w:rFonts w:ascii="Times New Roman" w:hAnsi="Times New Roman" w:eastAsia="SimSun"/>
                 <w:sz w:val="24"/>
               </w:rPr>
-              <w:t>项目一：基于二维码的库存管理网站——需求分析。</w:t>
+              <w:t>12/10：了解项目及查阅现有库存、表单和二维码资料。</w:t>
               <w:br/>
               <w:br/>
-              <w:t>通过线上讨论及线下会议与客户沟通，了解现有库存记录流程，以及工人扫描商品二维码的操作需求。</w:t>
+              <w:t>13/10：线上需求讨论（具体日期待核对）。</w:t>
               <w:br/>
               <w:br/>
-              <w:t>查阅库存电子表格、Google Form 和二维码 PDF，整理商品识别、进货与领货、照片凭证、管理员权限及补货警戒值等初步需求。</w:t>
+              <w:t>14/10：线下澄清角色、单位与扫码流程（日期待核对）。</w:t>
               <w:br/>
               <w:br/>
-              <w:t>拟定工人与管理员的主要操作流程，并研究以手机友好的网站代替原生应用程序的可行性。</w:t>
+              <w:t>15/10：整理工人、管理员及系统需求。</w:t>
+              <w:br/>
+              <w:br/>
+              <w:t>16/10：研究网页方案及开发工具。</w:t>
+              <w:br/>
+              <w:br/>
+              <w:t>17/10：拟定流程与数据字段（工作日期待核对）。</w:t>
+              <w:br/>
+              <w:br/>
+              <w:t>18/10：星期日，工作安排待确认。</w:t>
             </w:r>
           </w:p>
         </w:tc>
@@ -2956,18 +3338,40 @@
               </w:rPr>
               <w:t>第二周</w:t>
               <w:br/>
-              <w:t>10/19–24</w:t>
+              <w:t>10/19–25</w:t>
             </w:r>
           </w:p>
         </w:tc>
         <w:tc>
           <w:tcPr/>
           <w:p>
-            <w:r>
-              <w:t>截至 10 月 21 日：研究 HTML、CSS、JavaScript、Apps Script、Sheets 与 Drive，规划数据和流程，并准备初步网站原型。</w:t>
+            <w:pPr>
+              <w:spacing w:line="360" w:lineRule="auto"/>
+            </w:pPr>
+            <w:r>
+              <w:rPr>
+                <w:rFonts w:ascii="Times New Roman" w:hAnsi="Times New Roman" w:eastAsia="SimSun"/>
+                <w:sz w:val="24"/>
+              </w:rPr>
+              <w:t>19/10：完善商品、交易及设置数据组织。</w:t>
               <w:br/>
               <w:br/>
-              <w:t>原型涵盖商品扫码、员工 ID、数量与照片、库存计算及管理功能。10 月 22–24 日拟检查和整理原型，准备交客户检视；正式反馈及修改尚待确认。</w:t>
+              <w:t>20/10：初步工人界面与提交流程。</w:t>
+              <w:br/>
+              <w:br/>
+              <w:t>21/10：整理管理功能及原型，准备客户检视。</w:t>
+              <w:br/>
+              <w:br/>
+              <w:t>22/10（计划）：按既有需求检查原型与资料。</w:t>
+              <w:br/>
+              <w:br/>
+              <w:t>23/10（计划）：检视标签及管理界面。</w:t>
+              <w:br/>
+              <w:br/>
+              <w:t>24/10（计划）：整理需求表及客户审阅材料。</w:t>
+              <w:br/>
+              <w:br/>
+              <w:t>25/10：星期日，工作安排待确认。</w:t>
             </w:r>
           </w:p>
         </w:tc>
@@ -2995,19 +3399,43 @@
         <w:tc>
           <w:tcPr/>
           <w:p>
-            <w:r/>
+            <w:pPr>
+              <w:spacing w:line="360" w:lineRule="auto"/>
+            </w:pPr>
+            <w:r>
+              <w:rPr>
+                <w:rFonts w:ascii="Times New Roman" w:hAnsi="Times New Roman" w:eastAsia="SimSun"/>
+                <w:sz w:val="24"/>
+              </w:rPr>
+            </w:r>
           </w:p>
         </w:tc>
         <w:tc>
           <w:tcPr/>
           <w:p>
-            <w:r/>
+            <w:pPr>
+              <w:spacing w:line="360" w:lineRule="auto"/>
+            </w:pPr>
+            <w:r>
+              <w:rPr>
+                <w:rFonts w:ascii="Times New Roman" w:hAnsi="Times New Roman" w:eastAsia="SimSun"/>
+                <w:sz w:val="24"/>
+              </w:rPr>
+            </w:r>
           </w:p>
         </w:tc>
         <w:tc>
           <w:tcPr/>
           <w:p>
-            <w:r/>
+            <w:pPr>
+              <w:spacing w:line="360" w:lineRule="auto"/>
+            </w:pPr>
+            <w:r>
+              <w:rPr>
+                <w:rFonts w:ascii="Times New Roman" w:hAnsi="Times New Roman" w:eastAsia="SimSun"/>
+                <w:sz w:val="24"/>
+              </w:rPr>
+            </w:r>
           </w:p>
         </w:tc>
       </w:tr>
@@ -3020,19 +3448,43 @@
         <w:tc>
           <w:tcPr/>
           <w:p>
-            <w:r/>
+            <w:pPr>
+              <w:spacing w:line="360" w:lineRule="auto"/>
+            </w:pPr>
+            <w:r>
+              <w:rPr>
+                <w:rFonts w:ascii="Times New Roman" w:hAnsi="Times New Roman" w:eastAsia="SimSun"/>
+                <w:sz w:val="24"/>
+              </w:rPr>
+            </w:r>
           </w:p>
         </w:tc>
         <w:tc>
           <w:tcPr/>
           <w:p>
-            <w:r/>
+            <w:pPr>
+              <w:spacing w:line="360" w:lineRule="auto"/>
+            </w:pPr>
+            <w:r>
+              <w:rPr>
+                <w:rFonts w:ascii="Times New Roman" w:hAnsi="Times New Roman" w:eastAsia="SimSun"/>
+                <w:sz w:val="24"/>
+              </w:rPr>
+            </w:r>
           </w:p>
         </w:tc>
         <w:tc>
           <w:tcPr/>
           <w:p>
-            <w:r/>
+            <w:pPr>
+              <w:spacing w:line="360" w:lineRule="auto"/>
+            </w:pPr>
+            <w:r>
+              <w:rPr>
+                <w:rFonts w:ascii="Times New Roman" w:hAnsi="Times New Roman" w:eastAsia="SimSun"/>
+                <w:sz w:val="24"/>
+              </w:rPr>
+            </w:r>
           </w:p>
         </w:tc>
       </w:tr>
@@ -3047,7 +3499,14 @@
             <w:gridSpan w:val="3"/>
           </w:tcPr>
           <w:p>
-            <w:r>
+            <w:pPr>
+              <w:spacing w:line="360" w:lineRule="auto"/>
+            </w:pPr>
+            <w:r>
+              <w:rPr>
+                <w:rFonts w:ascii="Times New Roman" w:hAnsi="Times New Roman" w:eastAsia="SimSun"/>
+                <w:sz w:val="24"/>
+              </w:rPr>
               <w:t>月份总结：2026 年 10 月</w:t>
             </w:r>
           </w:p>
@@ -3064,7 +3523,15 @@
             <w:gridSpan w:val="3"/>
           </w:tcPr>
           <w:p>
-            <w:r/>
+            <w:pPr>
+              <w:spacing w:line="360" w:lineRule="auto"/>
+            </w:pPr>
+            <w:r>
+              <w:rPr>
+                <w:rFonts w:ascii="Times New Roman" w:hAnsi="Times New Roman" w:eastAsia="SimSun"/>
+                <w:sz w:val="24"/>
+              </w:rPr>
+            </w:r>
           </w:p>
         </w:tc>
       </w:tr>
@@ -12138,14 +12605,15 @@
     <w:basedOn w:val="Normal"/>
     <w:next w:val="Normal"/>
     <w:pPr>
-      <w:keepNext w:val="1"/>
+      <w:keepNext/>
       <w:keepLines w:val="1"/>
       <w:pageBreakBefore w:val="0"/>
-      <w:spacing w:after="80" w:before="280" w:lineRule="auto"/>
+      <w:spacing w:after="120" w:before="240" w:lineRule="auto"/>
     </w:pPr>
     <w:rPr>
-      <w:b w:val="1"/>
-      <w:sz w:val="28"/>
+      <w:rFonts w:ascii="Times New Roman" w:hAnsi="Times New Roman" w:eastAsia="SimSun"/>
+      <w:b/>
+      <w:sz w:val="24"/>
       <w:szCs w:val="28"/>
     </w:rPr>
   </w:style>

</xml_diff>

<commit_message>
Record confirmed Saturday half-days and Sunday rest days in bilingual reports
</commit_message>
<xml_diff>
--- a/docs/internship-report/GD008_Complete_Project_1_Report_Chinese_Draft.docx
+++ b/docs/internship-report/GD008_Complete_Project_1_Report_Chinese_Draft.docx
@@ -1244,7 +1244,7 @@
         <w:jc w:val="both"/>
       </w:pPr>
       <w:r>
-        <w:t>逐日编排说明：本节将上一版相同的活动扩写并按日期暂分配，并非已经核实的逐日出勤日志。12–21 日的具体任务日期须按实际记录确认；22–25 日为未来安排。线上与线下沟通确属原需求，但具体会议日期尚未提供。星期日是否工作待确认，后续客户反馈、修改及维护不预先编写。</w:t>
+        <w:t>逐日编排说明：本节将上一版相同的活动扩写并按日期暂分配，并非已经核实的逐日出勤日志。12–21 日的具体任务日期须按实际记录确认；22–25 日为未来安排。线上与线下沟通确属原需求，但具体会议日期尚未提供。星期六工作至中午 12 点，星期日没有上班，后续客户反馈、修改及维护不预先编写。</w:t>
       </w:r>
     </w:p>
     <w:p>
@@ -1405,7 +1405,7 @@
         <w:pStyle w:val="Heading3"/>
       </w:pPr>
       <w:r>
-        <w:t>2026 年 10 月 17 日（星期六）——初步流程与数据字段规划</w:t>
+        <w:t>2026 年 10 月 17 日（星期六，工作至中午 12 点）——初步流程与数据字段规划</w:t>
       </w:r>
     </w:p>
     <w:p>
@@ -1426,7 +1426,7 @@
         <w:jc w:val="both"/>
       </w:pPr>
       <w:r>
-        <w:t>我规划分开保存商品与交易。商品包括编号、名称、单位、期初库存、警戒值和图片引用；交易包括对应商品、进出类型、数量、员工 ID、时间及照片引用。计算规则为期初库存加有效进货，再减有效领货。这为初步原型建立基础。星期六的任务归属仍须核对实际出勤。</w:t>
+        <w:t>我规划分开保存商品与交易。商品包括编号、名称、单位、期初库存、警戒值和图片引用；交易包括对应商品、进出类型、数量、员工 ID、时间及照片引用。计算规则为期初库存加有效进货，再减有效领货。这为初步原型建立基础。星期六为半天工作，至中午 12 点；具体任务日期仍须按实际记录核对。</w:t>
       </w:r>
     </w:p>
     <w:p>
@@ -1434,7 +1434,7 @@
         <w:pStyle w:val="Heading3"/>
       </w:pPr>
       <w:r>
-        <w:t>2026 年 10 月 18 日（星期日）——活动记录待确认</w:t>
+        <w:t>2026 年 10 月 18 日（星期日）——休息日</w:t>
       </w:r>
     </w:p>
     <w:p>
@@ -1444,7 +1444,7 @@
         <w:jc w:val="both"/>
       </w:pPr>
       <w:r>
-        <w:t>目前没有提供这个星期日的实际工作或出勤资料，因此不声称当天进行了会议、开发或特定工时。如实际为休息日，应按实记录；如确有项目工作，则在提交前补入实际任务与结果。</w:t>
+        <w:t>星期日为休息日，没有上班。本日不记录会议、开发或项目任务。</w:t>
       </w:r>
     </w:p>
     <w:p>
@@ -1605,7 +1605,7 @@
         <w:pStyle w:val="Heading3"/>
       </w:pPr>
       <w:r>
-        <w:t>2026 年 10 月 24 日（星期六）——计划整理客户审阅材料</w:t>
+        <w:t>2026 年 10 月 24 日（星期六，工作至中午 12 点）——计划整理客户审阅材料</w:t>
       </w:r>
     </w:p>
     <w:p>
@@ -1626,7 +1626,7 @@
         <w:jc w:val="both"/>
       </w:pPr>
       <w:r>
-        <w:t>预期阶段成果是准备好接受反馈的原型，不假定已取得最终验收。由于尚未收到反馈，具体修改及维护不预先编写。这个星期六是否工作及实际完成了哪些准备，都需要之后确认。</w:t>
+        <w:t>预期阶段成果是准备好接受反馈的原型，不假定已取得最终验收。由于尚未收到反馈，具体修改及维护不预先编写。星期六仅安排上午工作，至中午 12 点；实际完成的准备内容仍待确认。</w:t>
       </w:r>
     </w:p>
     <w:p>
@@ -1634,7 +1634,7 @@
         <w:pStyle w:val="Heading3"/>
       </w:pPr>
       <w:r>
-        <w:t>2026 年 10 月 25 日（星期日）——工作安排待确认</w:t>
+        <w:t>2026 年 10 月 25 日（星期日）——休息日</w:t>
       </w:r>
     </w:p>
     <w:p>
@@ -1644,7 +1644,7 @@
         <w:jc w:val="both"/>
       </w:pPr>
       <w:r>
-        <w:t>保留此日期是为了覆盖要求的 10 月 12–25 日，但不假定当天有工作；相对本稿日期，这也是未来日期。如实际休息，按休息日记录；如有项目工作，之后补入核实内容。不声称当天已完成客户检视、测试、修改或维护。</w:t>
+        <w:t>按已确认的工作安排，星期日没有上班。本日为计划休息日，不安排工作任务，也不记录尚未发生的会议、测试或修改。</w:t>
       </w:r>
     </w:p>
     <w:p>
@@ -3297,10 +3297,10 @@
               <w:t>16/10：研究网页方案及开发工具。</w:t>
               <w:br/>
               <w:br/>
-              <w:t>17/10：拟定流程与数据字段（工作日期待核对）。</w:t>
+              <w:t>17/10（上午，至中午 12 点）：拟定流程与数据字段。</w:t>
               <w:br/>
               <w:br/>
-              <w:t>18/10：星期日，工作安排待确认。</w:t>
+              <w:t>18/10：星期日休息，没有上班。</w:t>
             </w:r>
           </w:p>
         </w:tc>
@@ -3368,10 +3368,10 @@
               <w:t>23/10（计划）：检视标签及管理界面。</w:t>
               <w:br/>
               <w:br/>
-              <w:t>24/10（计划）：整理需求表及客户审阅材料。</w:t>
+              <w:t>24/10（上午计划，至中午 12 点）：整理需求表及客户审阅材料。</w:t>
               <w:br/>
               <w:br/>
-              <w:t>25/10：星期日，工作安排待确认。</w:t>
+              <w:t>25/10：星期日休息，不安排工作。</w:t>
             </w:r>
           </w:p>
         </w:tc>

</xml_diff>

<commit_message>
Add company background from offer letter while excluding private intern details
</commit_message>
<xml_diff>
--- a/docs/internship-report/GD008_Complete_Project_1_Report_Chinese_Draft.docx
+++ b/docs/internship-report/GD008_Complete_Project_1_Report_Chinese_Draft.docx
@@ -1119,7 +1119,7 @@
         <w:jc w:val="both"/>
       </w:pPr>
       <w:r>
-        <w:t>实习单位为 Bakti Makmur (M) Sdn. Bhd.，实习期为 2026 年 10 月 12 日至 2027 年 1 月 9 日，企业主管为 Christopher Kong San Hor，职位 IT Technician。本部分只记录第一个项目——二维码库存管理网站的第一、二周。公司背景资料及 Logo 之后补充。</w:t>
+        <w:t>实习单位为 Bakti Makmur (M) Sdn. Bhd.，注册编号 1316038-M，地址为 A13, Tingkat Bawah, Lorong Seri Setali 113/1, Perumahan Seri Setali, 25300 Kuantan, Pahang。公司电话／传真为 09-509 3745，电邮为 baktimakmurm@yahoo.com。上述资料来自 2026 年 9 月 15 日的实习录取信，公司 Logo 之后另加。</w:t>
       </w:r>
     </w:p>
     <w:p>
@@ -1130,6 +1130,36 @@
       </w:pPr>
       <w:r>
         <w:t>客户原本使用商品二维码连接 Google Form。项目将领货、进货、员工 ID 与照片凭证整合到手机友好的网站，并由管理员查看库存数量及执行管理操作。</w:t>
+      </w:r>
+    </w:p>
+    <w:p>
+      <w:pPr>
+        <w:spacing w:line="360" w:lineRule="auto" w:after="200"/>
+        <w:ind w:firstLine="720"/>
+        <w:jc w:val="both"/>
+      </w:pPr>
+      <w:r>
+        <w:t>录取信提供的职位为 IT Technician，部门为 IT Department，实习期间为 2026 年 10 月 12 日至 2027 年 1 月 9 日。职责说明包括协助 IT 基础设施、网络、备份、用户账号、办公与应用系统支持，并参与系统改善；这些是岗位范围，不表示本阶段已执行所有职责。本报告仍只记录前两周的库存网站项目。</w:t>
+      </w:r>
+    </w:p>
+    <w:p>
+      <w:pPr>
+        <w:spacing w:line="360" w:lineRule="auto" w:after="200"/>
+        <w:ind w:firstLine="720"/>
+        <w:jc w:val="both"/>
+      </w:pPr>
+      <w:r>
+        <w:t>录取信说明实习生向 Managing Director Christopher Kong San Hor 及 Executive Director Alexander Kong San Lum 汇报。这是已知的实习汇报关系，不是完整公司组织架构。IT Plan 将 Christopher Kong San Hor 的职位列为 IT Technician，与录取信不同，正式提交前须确认。录取信未说明公司的主要业务性质，因此不自行编造行业背景。</w:t>
+      </w:r>
+    </w:p>
+    <w:p>
+      <w:pPr>
+        <w:spacing w:line="360" w:lineRule="auto" w:after="200"/>
+        <w:ind w:firstLine="720"/>
+        <w:jc w:val="both"/>
+      </w:pPr>
+      <w:r>
+        <w:t>正常工作时间为星期一至五上午 8 点至下午 5 点，含一小时午休；星期六上午 8 点至中午 12 点。星期日不上班，依据学生另外确认的安排。具体每日任务仍按实际记录核对。</w:t>
       </w:r>
     </w:p>
     <w:p>
@@ -3491,7 +3521,7 @@
         <w:jc w:val="both"/>
       </w:pPr>
       <w:r>
-        <w:t>主管：Christopher Kong San Hor｜IT Technician</w:t>
+        <w:t>主管：Christopher Kong San Hor｜Managing Director（录取信；IT Plan 列为 IT Technician，提交前须确认）</w:t>
       </w:r>
     </w:p>
     <w:p>

</xml_diff>

<commit_message>
Align report formatting and required sections with GD007 rev06
</commit_message>
<xml_diff>
--- a/docs/internship-report/GD008_Complete_Project_1_Report_Chinese_Draft.docx
+++ b/docs/internship-report/GD008_Complete_Project_1_Report_Chinese_Draft.docx
@@ -825,7 +825,7 @@
         <w:sectPr>
           <w:headerReference w:type="default" r:id="rId13"/>
           <w:footerReference w:type="default" r:id="rId14"/>
-          <w:pgSz w:h="16840" w:w="11910" w:orient="portrait"/>
+          <w:pgSz w:h="16838" w:w="11906" w:orient="portrait"/>
           <w:pgMar w:bottom="280" w:top="1580" w:left="1680" w:right="1180" w:header="720" w:footer="720"/>
           <w:pgNumType w:start="1"/>
         </w:sectPr>
@@ -919,7 +919,7 @@
       <w:pPr>
         <w:sectPr>
           <w:type w:val="nextPage"/>
-          <w:pgSz w:h="16840" w:w="11910" w:orient="portrait"/>
+          <w:pgSz w:h="16838" w:w="11906" w:orient="portrait"/>
           <w:pgMar w:bottom="1660" w:top="1320" w:left="1080" w:right="500" w:header="0" w:footer="1474"/>
         </w:sectPr>
       </w:pPr>
@@ -1006,15 +1006,6 @@
       </w:pPr>
       <w:r>
         <w:t>本阶段报告涵盖 2026 年 10 月 12–25 日，即第一个项目——二维码库存管理网站的前两个报告周。将上一版相同的需求、研究、流程与数据设计及初步原型内容扩写为逐日记录。原型待客户检视；具体每日分配须核实，21 日之后仍属计划，不将后续反馈、修改与维护写为已完成工作。</w:t>
-      </w:r>
-    </w:p>
-    <w:p>
-      <w:pPr>
-        <w:widowControl/>
-        <w:jc w:val="both"/>
-      </w:pPr>
-      <w:r>
-        <w:t>关键词：库存管理；二维码；网页应用；Google Apps Script；实习。</w:t>
       </w:r>
     </w:p>
     <w:p>
@@ -1091,7 +1082,7 @@
         <w:sectPr>
           <w:headerReference w:type="default" r:id="rId15"/>
           <w:footerReference w:type="default" r:id="rId16"/>
-          <w:pgSz w:h="16840" w:w="11910" w:orient="portrait"/>
+          <w:pgSz w:h="16838" w:w="11906" w:orient="portrait"/>
           <w:pgMar w:bottom="1660" w:top="1320" w:left="1080" w:right="500" w:header="0" w:footer="1474"/>
           <w:pgNumType w:fmt="lowerRoman" w:start="1"/>
         </w:sectPr>
@@ -1100,6 +1091,8 @@
     <w:p>
       <w:pPr>
         <w:pStyle w:val="Heading1"/>
+        <w:keepNext/>
+        <w:pageBreakBefore/>
       </w:pPr>
       <w:r>
         <w:t>第一章——绪论</w:t>
@@ -1108,6 +1101,8 @@
     <w:p>
       <w:pPr>
         <w:pStyle w:val="Heading2"/>
+        <w:keepNext/>
+        <w:spacing w:after="360"/>
       </w:pPr>
       <w:r>
         <w:t>1.1 实习与项目背景</w:t>
@@ -1116,55 +1111,213 @@
     <w:p>
       <w:pPr>
         <w:widowControl/>
+        <w:spacing w:line="360" w:lineRule="auto" w:after="360"/>
+        <w:ind w:firstLine="0"/>
         <w:jc w:val="both"/>
       </w:pPr>
       <w:r>
+        <w:rPr>
+          <w:rFonts w:ascii="Times New Roman" w:hAnsi="Times New Roman" w:eastAsia="SimSun"/>
+          <w:sz w:val="24"/>
+        </w:rPr>
         <w:t>实习单位为 Bakti Makmur (M) Sdn. Bhd.，注册编号 1316038-M，地址为 A13, Tingkat Bawah, Lorong Seri Setali 113/1, Perumahan Seri Setali, 25300 Kuantan, Pahang。公司电话／传真为 09-509 3745，电邮为 baktimakmurm@yahoo.com。上述资料来自 2026 年 9 月 15 日的实习录取信，公司 Logo 之后另加。</w:t>
+      </w:r>
+      <w:r>
+        <w:t>（Bakti Makmur (M) Sdn. Bhd., 2026）</w:t>
       </w:r>
     </w:p>
     <w:p>
       <w:pPr>
         <w:widowControl/>
+        <w:spacing w:line="360" w:lineRule="auto" w:after="360"/>
         <w:ind w:firstLine="720"/>
         <w:jc w:val="both"/>
       </w:pPr>
       <w:r>
+        <w:rPr>
+          <w:rFonts w:ascii="Times New Roman" w:hAnsi="Times New Roman" w:eastAsia="SimSun"/>
+          <w:sz w:val="24"/>
+        </w:rPr>
         <w:t>客户原本使用商品二维码连接 Google Form。项目将领货、进货、员工 ID 与照片凭证整合到手机友好的网站，并由管理员查看库存数量及执行管理操作。</w:t>
       </w:r>
     </w:p>
     <w:p>
       <w:pPr>
-        <w:spacing w:line="360" w:lineRule="auto" w:after="200"/>
+        <w:widowControl/>
+        <w:spacing w:line="360" w:lineRule="auto" w:after="360"/>
         <w:ind w:firstLine="720"/>
         <w:jc w:val="both"/>
       </w:pPr>
       <w:r>
+        <w:rPr>
+          <w:rFonts w:ascii="Times New Roman" w:hAnsi="Times New Roman" w:eastAsia="SimSun"/>
+          <w:sz w:val="24"/>
+        </w:rPr>
         <w:t>录取信提供的职位为 IT Technician，部门为 IT Department，实习期间为 2026 年 10 月 12 日至 2027 年 1 月 9 日。职责说明包括协助 IT 基础设施、网络、备份、用户账号、办公与应用系统支持，并参与系统改善；这些是岗位范围，不表示本阶段已执行所有职责。本报告仍只记录前两周的库存网站项目。</w:t>
       </w:r>
     </w:p>
     <w:p>
       <w:pPr>
-        <w:spacing w:line="360" w:lineRule="auto" w:after="200"/>
+        <w:widowControl/>
+        <w:spacing w:line="360" w:lineRule="auto" w:after="360"/>
         <w:ind w:firstLine="720"/>
         <w:jc w:val="both"/>
       </w:pPr>
       <w:r>
+        <w:rPr>
+          <w:rFonts w:ascii="Times New Roman" w:hAnsi="Times New Roman" w:eastAsia="SimSun"/>
+          <w:sz w:val="24"/>
+        </w:rPr>
         <w:t>录取信说明实习生向 Managing Director Christopher Kong San Hor 及 Executive Director Alexander Kong San Lum 汇报。这是已知的实习汇报关系，不是完整公司组织架构。IT Plan 将 Christopher Kong San Hor 的职位列为 IT Technician，与录取信不同，正式提交前须确认。录取信未说明公司的主要业务性质，因此不自行编造行业背景。</w:t>
       </w:r>
     </w:p>
     <w:p>
       <w:pPr>
-        <w:spacing w:line="360" w:lineRule="auto" w:after="200"/>
+        <w:widowControl/>
+        <w:spacing w:line="360" w:lineRule="auto" w:after="360"/>
         <w:ind w:firstLine="720"/>
         <w:jc w:val="both"/>
       </w:pPr>
       <w:r>
+        <w:rPr>
+          <w:rFonts w:ascii="Times New Roman" w:hAnsi="Times New Roman" w:eastAsia="SimSun"/>
+          <w:sz w:val="24"/>
+        </w:rPr>
         <w:t>正常工作时间为星期一至五上午 8 点至下午 5 点，含一小时午休；星期六上午 8 点至中午 12 点。星期日不上班，依据学生另外确认的安排。具体每日任务仍按实际记录核对。</w:t>
       </w:r>
     </w:p>
     <w:p>
       <w:pPr>
+        <w:keepNext/>
+      </w:pPr>
+      <w:r>
+        <w:t>图 1.1：录取信列明的实习汇报关系（非完整公司组织架构）</w:t>
+      </w:r>
+    </w:p>
+    <w:tbl>
+      <w:tblPr>
+        <w:tblStyle w:val="Table2"/>
+        <w:tblW w:type="auto" w:w="0"/>
+        <w:tblLook w:firstColumn="1" w:firstRow="1" w:lastColumn="0" w:lastRow="0" w:noHBand="0" w:noVBand="1" w:val="04A0"/>
+      </w:tblPr>
+      <w:tblGrid>
+        <w:gridCol w:w="5163"/>
+        <w:gridCol w:w="5163"/>
+      </w:tblGrid>
+      <w:tr>
+        <w:tc>
+          <w:tcPr>
+            <w:tcW w:type="dxa" w:w="5163"/>
+          </w:tcPr>
+          <w:p>
+            <w:pPr>
+              <w:spacing w:line="360" w:lineRule="auto" w:after="80"/>
+              <w:jc w:val="center"/>
+            </w:pPr>
+            <w:r>
+              <w:rPr>
+                <w:rFonts w:ascii="Times New Roman" w:hAnsi="Times New Roman" w:eastAsia="SimSun"/>
+                <w:sz w:val="24"/>
+              </w:rPr>
+              <w:t>Christopher Kong San Hor</w:t>
+              <w:br/>
+              <w:t>Managing Director</w:t>
+            </w:r>
+          </w:p>
+        </w:tc>
+        <w:tc>
+          <w:tcPr>
+            <w:tcW w:type="dxa" w:w="5163"/>
+          </w:tcPr>
+          <w:p>
+            <w:pPr>
+              <w:spacing w:line="360" w:lineRule="auto" w:after="80"/>
+              <w:jc w:val="center"/>
+            </w:pPr>
+            <w:r>
+              <w:rPr>
+                <w:rFonts w:ascii="Times New Roman" w:hAnsi="Times New Roman" w:eastAsia="SimSun"/>
+                <w:sz w:val="24"/>
+              </w:rPr>
+              <w:t>Alexander Kong San Lum</w:t>
+              <w:br/>
+              <w:t>Executive Director</w:t>
+            </w:r>
+          </w:p>
+        </w:tc>
+      </w:tr>
+      <w:tr>
+        <w:tc>
+          <w:tcPr>
+            <w:tcW w:type="dxa" w:w="5163"/>
+          </w:tcPr>
+          <w:p>
+            <w:pPr>
+              <w:spacing w:line="360" w:lineRule="auto" w:after="80"/>
+              <w:jc w:val="center"/>
+            </w:pPr>
+            <w:r>
+              <w:rPr>
+                <w:rFonts w:ascii="Times New Roman" w:hAnsi="Times New Roman" w:eastAsia="SimSun"/>
+                <w:sz w:val="24"/>
+              </w:rPr>
+              <w:t>↓</w:t>
+            </w:r>
+          </w:p>
+        </w:tc>
+        <w:tc>
+          <w:tcPr>
+            <w:tcW w:type="dxa" w:w="5163"/>
+          </w:tcPr>
+          <w:p>
+            <w:pPr>
+              <w:spacing w:line="360" w:lineRule="auto" w:after="80"/>
+              <w:jc w:val="center"/>
+            </w:pPr>
+            <w:r>
+              <w:rPr>
+                <w:rFonts w:ascii="Times New Roman" w:hAnsi="Times New Roman" w:eastAsia="SimSun"/>
+                <w:sz w:val="24"/>
+              </w:rPr>
+              <w:t>↓</w:t>
+            </w:r>
+          </w:p>
+        </w:tc>
+      </w:tr>
+      <w:tr>
+        <w:tc>
+          <w:tcPr>
+            <w:tcW w:type="dxa" w:w="10326"/>
+            <w:gridSpan w:val="2"/>
+          </w:tcPr>
+          <w:p>
+            <w:pPr>
+              <w:spacing w:line="360" w:lineRule="auto" w:after="80"/>
+              <w:jc w:val="center"/>
+            </w:pPr>
+            <w:r>
+              <w:rPr>
+                <w:rFonts w:ascii="Times New Roman" w:hAnsi="Times New Roman" w:eastAsia="SimSun"/>
+                <w:sz w:val="24"/>
+              </w:rPr>
+              <w:t>Wong Sook En</w:t>
+              <w:br/>
+              <w:t>IT Technician 实习生</w:t>
+            </w:r>
+          </w:p>
+        </w:tc>
+      </w:tr>
+    </w:tbl>
+    <w:p>
+      <w:r>
+        <w:t>完整公司组织架构及主要业务仍需公司确认；主管职位与 IT Plan 的差异也待核实。</w:t>
+      </w:r>
+    </w:p>
+    <w:p>
+      <w:pPr>
         <w:pStyle w:val="Heading2"/>
+        <w:keepNext/>
+        <w:spacing w:after="360"/>
       </w:pPr>
       <w:r>
         <w:t>1.2 目标与范围</w:t>
@@ -1173,9 +1326,15 @@
     <w:p>
       <w:pPr>
         <w:widowControl/>
+        <w:spacing w:line="360" w:lineRule="auto" w:after="360"/>
+        <w:ind w:firstLine="0"/>
         <w:jc w:val="both"/>
       </w:pPr>
       <w:r>
+        <w:rPr>
+          <w:rFonts w:ascii="Times New Roman" w:hAnsi="Times New Roman" w:eastAsia="SimSun"/>
+          <w:sz w:val="24"/>
+        </w:rPr>
         <w:t>目标是简化扫码记录、自动计算库存，并提供商品维护、错误记录更正、补货提醒，以及附照片的二维码标签打印。方案使用现有 Google 服务，不开发原生手机应用。额外消息渠道暂不纳入本阶段范围。</w:t>
       </w:r>
     </w:p>
@@ -1187,6 +1346,7 @@
     <w:p>
       <w:pPr>
         <w:pStyle w:val="Heading1"/>
+        <w:keepNext/>
       </w:pPr>
       <w:r>
         <w:t>第二章——研究与学习</w:t>
@@ -1195,6 +1355,8 @@
     <w:p>
       <w:pPr>
         <w:pStyle w:val="Heading2"/>
+        <w:keepNext/>
+        <w:spacing w:after="360"/>
       </w:pPr>
       <w:r>
         <w:t>2.1 需求与技术选型</w:t>
@@ -1203,33 +1365,53 @@
     <w:p>
       <w:pPr>
         <w:widowControl/>
+        <w:spacing w:line="360" w:lineRule="auto" w:after="360"/>
+        <w:ind w:firstLine="0"/>
         <w:jc w:val="both"/>
       </w:pPr>
       <w:r>
+        <w:rPr>
+          <w:rFonts w:ascii="Times New Roman" w:hAnsi="Times New Roman" w:eastAsia="SimSun"/>
+          <w:sz w:val="24"/>
+        </w:rPr>
         <w:t>我查阅客户提供的库存表、Google Form 和商品二维码 PDF，并通过线上及线下沟通理解需求。主要要求包括扫描对应商品、输入员工 ID 和数量、提供照片、区分管理员权限，以及每件商品独立的补货警戒值。</w:t>
       </w:r>
     </w:p>
     <w:p>
       <w:pPr>
         <w:widowControl/>
+        <w:spacing w:line="360" w:lineRule="auto" w:after="360"/>
         <w:ind w:firstLine="720"/>
         <w:jc w:val="both"/>
       </w:pPr>
       <w:r>
+        <w:rPr>
+          <w:rFonts w:ascii="Times New Roman" w:hAnsi="Times New Roman" w:eastAsia="SimSun"/>
+          <w:sz w:val="24"/>
+        </w:rPr>
         <w:t>界面选择 HTML、CSS 和 JavaScript，后台使用 Google Apps Script，Google Sheets 保存商品与交易记录，Google Drive 储存照片。网站让工人通过手机相机直接进入商品表单，无须安装应用。</w:t>
       </w:r>
     </w:p>
     <w:p>
       <w:pPr>
+        <w:widowControl/>
+        <w:spacing w:line="360" w:lineRule="auto" w:after="360"/>
+        <w:ind w:firstLine="720"/>
         <w:jc w:val="both"/>
       </w:pPr>
       <w:r>
+        <w:rPr>
+          <w:rFonts w:ascii="Times New Roman" w:hAnsi="Times New Roman" w:eastAsia="SimSun"/>
+          <w:sz w:val="24"/>
+        </w:rPr>
         <w:t>从技术职责看，HTML 定义商品选择、输入字段及管理表格；CSS 提供手机布局和打印样式；JavaScript 负责交互、输入准备和二维码生成。Apps Script 在后台核对请求并连接表格与文件，避免让工人直接修改库存表。工具分工围绕相同需求展开，没有增加新的项目范围。</w:t>
       </w:r>
     </w:p>
     <w:p>
       <w:pPr>
         <w:pStyle w:val="Heading2"/>
+        <w:keepNext/>
+        <w:spacing w:after="360"/>
       </w:pPr>
       <w:r>
         <w:t>2.2 流程与初步原型</w:t>
@@ -1238,19 +1420,30 @@
     <w:p>
       <w:pPr>
         <w:widowControl/>
+        <w:spacing w:line="360" w:lineRule="auto" w:after="360"/>
+        <w:ind w:firstLine="0"/>
         <w:jc w:val="both"/>
       </w:pPr>
       <w:r>
+        <w:rPr>
+          <w:rFonts w:ascii="Times New Roman" w:hAnsi="Times New Roman" w:eastAsia="SimSun"/>
+          <w:sz w:val="24"/>
+        </w:rPr>
         <w:t>工人流程为扫描二维码、确认商品、填写员工 ID 和数量、附照片及提交。管理员可维护商品、查看库存、更正误填记录及打印指定标签。库存计算规则为期初库存加有效进货，再减有效领货。</w:t>
       </w:r>
     </w:p>
     <w:p>
       <w:pPr>
         <w:widowControl/>
+        <w:spacing w:line="360" w:lineRule="auto" w:after="360"/>
         <w:ind w:firstLine="720"/>
         <w:jc w:val="both"/>
       </w:pPr>
       <w:r>
+        <w:rPr>
+          <w:rFonts w:ascii="Times New Roman" w:hAnsi="Times New Roman" w:eastAsia="SimSun"/>
+          <w:sz w:val="24"/>
+        </w:rPr>
         <w:t>研究和初步开发后，已具备供客户检视的原型。设计考虑包括数量验证、库存不足拦截、防止重复提交及后台管理权限检查。员工 ID 仍是自行填写，共用管理员密码也属于初版限制。</w:t>
       </w:r>
     </w:p>
@@ -1262,6 +1455,7 @@
     <w:p>
       <w:pPr>
         <w:pStyle w:val="Heading1"/>
+        <w:keepNext/>
       </w:pPr>
       <w:r>
         <w:t>第三章——工业实习工作经验</w:t>
@@ -1270,16 +1464,23 @@
     <w:p>
       <w:pPr>
         <w:widowControl/>
-        <w:spacing w:line="360" w:lineRule="auto" w:after="200"/>
+        <w:spacing w:line="360" w:lineRule="auto" w:after="360"/>
+        <w:ind w:firstLine="0"/>
         <w:jc w:val="both"/>
       </w:pPr>
       <w:r>
+        <w:rPr>
+          <w:rFonts w:ascii="Times New Roman" w:hAnsi="Times New Roman" w:eastAsia="SimSun"/>
+          <w:sz w:val="24"/>
+        </w:rPr>
         <w:t>逐日编排说明：本节将上一版相同的活动扩写并按日期暂分配，并非已经核实的逐日出勤日志。12–21 日的具体任务日期须按实际记录确认；22–25 日为未来安排。线上与线下沟通确属原需求，但具体会议日期尚未提供。星期六工作至中午 12 点，星期日没有上班，后续客户反馈、修改及维护不预先编写。</w:t>
       </w:r>
     </w:p>
     <w:p>
       <w:pPr>
         <w:pStyle w:val="Heading2"/>
+        <w:keepNext/>
+        <w:spacing w:after="360"/>
       </w:pPr>
       <w:r>
         <w:t>3.1 第一周：2026 年 10 月 12–18 日</w:t>
@@ -1289,7 +1490,7 @@
       <w:pPr>
         <w:keepNext w:val="0"/>
         <w:widowControl/>
-        <w:spacing w:line="360" w:lineRule="auto" w:before="0" w:after="120"/>
+        <w:spacing w:line="360" w:lineRule="auto" w:before="0" w:after="360"/>
         <w:ind w:firstLine="0"/>
         <w:jc w:val="both"/>
       </w:pPr>
@@ -1313,8 +1514,8 @@
       <w:pPr>
         <w:keepNext w:val="0"/>
         <w:widowControl/>
-        <w:spacing w:line="360" w:lineRule="auto" w:before="0" w:after="120"/>
-        <w:ind w:firstLine="0"/>
+        <w:spacing w:line="360" w:lineRule="auto" w:before="0" w:after="360"/>
+        <w:ind w:firstLine="720"/>
         <w:jc w:val="both"/>
       </w:pPr>
       <w:r>
@@ -1337,8 +1538,8 @@
       <w:pPr>
         <w:keepNext w:val="0"/>
         <w:widowControl/>
-        <w:spacing w:line="360" w:lineRule="auto" w:before="0" w:after="120"/>
-        <w:ind w:firstLine="0"/>
+        <w:spacing w:line="360" w:lineRule="auto" w:before="0" w:after="360"/>
+        <w:ind w:firstLine="720"/>
         <w:jc w:val="both"/>
       </w:pPr>
       <w:r>
@@ -1361,8 +1562,8 @@
       <w:pPr>
         <w:keepNext w:val="0"/>
         <w:widowControl/>
-        <w:spacing w:line="360" w:lineRule="auto" w:before="0" w:after="120"/>
-        <w:ind w:firstLine="0"/>
+        <w:spacing w:line="360" w:lineRule="auto" w:before="0" w:after="360"/>
+        <w:ind w:firstLine="720"/>
         <w:jc w:val="both"/>
       </w:pPr>
       <w:r>
@@ -1385,8 +1586,8 @@
       <w:pPr>
         <w:keepNext w:val="0"/>
         <w:widowControl/>
-        <w:spacing w:line="360" w:lineRule="auto" w:before="0" w:after="120"/>
-        <w:ind w:firstLine="0"/>
+        <w:spacing w:line="360" w:lineRule="auto" w:before="0" w:after="360"/>
+        <w:ind w:firstLine="720"/>
         <w:jc w:val="both"/>
       </w:pPr>
       <w:r>
@@ -1409,8 +1610,8 @@
       <w:pPr>
         <w:keepNext w:val="0"/>
         <w:widowControl/>
-        <w:spacing w:line="360" w:lineRule="auto" w:before="0" w:after="120"/>
-        <w:ind w:firstLine="0"/>
+        <w:spacing w:line="360" w:lineRule="auto" w:before="0" w:after="360"/>
+        <w:ind w:firstLine="720"/>
         <w:jc w:val="both"/>
       </w:pPr>
       <w:r>
@@ -1433,8 +1634,8 @@
       <w:pPr>
         <w:keepNext w:val="0"/>
         <w:widowControl/>
-        <w:spacing w:line="360" w:lineRule="auto" w:before="0" w:after="120"/>
-        <w:ind w:firstLine="0"/>
+        <w:spacing w:line="360" w:lineRule="auto" w:before="0" w:after="360"/>
+        <w:ind w:firstLine="720"/>
         <w:jc w:val="both"/>
       </w:pPr>
       <w:r>
@@ -1456,6 +1657,8 @@
     <w:p>
       <w:pPr>
         <w:pStyle w:val="Heading2"/>
+        <w:keepNext/>
+        <w:spacing w:after="360"/>
       </w:pPr>
       <w:r>
         <w:t>3.2 第二周：2026 年 10 月 19–25 日</w:t>
@@ -1465,7 +1668,7 @@
       <w:pPr>
         <w:keepNext w:val="0"/>
         <w:widowControl/>
-        <w:spacing w:line="360" w:lineRule="auto" w:before="0" w:after="120"/>
+        <w:spacing w:line="360" w:lineRule="auto" w:before="0" w:after="360"/>
         <w:ind w:firstLine="0"/>
         <w:jc w:val="both"/>
       </w:pPr>
@@ -1489,8 +1692,8 @@
       <w:pPr>
         <w:keepNext w:val="0"/>
         <w:widowControl/>
-        <w:spacing w:line="360" w:lineRule="auto" w:before="0" w:after="120"/>
-        <w:ind w:firstLine="0"/>
+        <w:spacing w:line="360" w:lineRule="auto" w:before="0" w:after="360"/>
+        <w:ind w:firstLine="720"/>
         <w:jc w:val="both"/>
       </w:pPr>
       <w:r>
@@ -1513,8 +1716,8 @@
       <w:pPr>
         <w:keepNext w:val="0"/>
         <w:widowControl/>
-        <w:spacing w:line="360" w:lineRule="auto" w:before="0" w:after="120"/>
-        <w:ind w:firstLine="0"/>
+        <w:spacing w:line="360" w:lineRule="auto" w:before="0" w:after="360"/>
+        <w:ind w:firstLine="720"/>
         <w:jc w:val="both"/>
       </w:pPr>
       <w:r>
@@ -1537,8 +1740,8 @@
       <w:pPr>
         <w:keepNext w:val="0"/>
         <w:widowControl/>
-        <w:spacing w:line="360" w:lineRule="auto" w:before="0" w:after="120"/>
-        <w:ind w:firstLine="0"/>
+        <w:spacing w:line="360" w:lineRule="auto" w:before="0" w:after="360"/>
+        <w:ind w:firstLine="720"/>
         <w:jc w:val="both"/>
       </w:pPr>
       <w:r>
@@ -1561,8 +1764,8 @@
       <w:pPr>
         <w:keepNext w:val="0"/>
         <w:widowControl/>
-        <w:spacing w:line="360" w:lineRule="auto" w:before="0" w:after="120"/>
-        <w:ind w:firstLine="0"/>
+        <w:spacing w:line="360" w:lineRule="auto" w:before="0" w:after="360"/>
+        <w:ind w:firstLine="720"/>
         <w:jc w:val="both"/>
       </w:pPr>
       <w:r>
@@ -1585,8 +1788,8 @@
       <w:pPr>
         <w:keepNext w:val="0"/>
         <w:widowControl/>
-        <w:spacing w:line="360" w:lineRule="auto" w:before="0" w:after="120"/>
-        <w:ind w:firstLine="0"/>
+        <w:spacing w:line="360" w:lineRule="auto" w:before="0" w:after="360"/>
+        <w:ind w:firstLine="720"/>
         <w:jc w:val="both"/>
       </w:pPr>
       <w:r>
@@ -1609,8 +1812,8 @@
       <w:pPr>
         <w:keepNext w:val="0"/>
         <w:widowControl/>
-        <w:spacing w:line="360" w:lineRule="auto" w:before="0" w:after="120"/>
-        <w:ind w:firstLine="0"/>
+        <w:spacing w:line="360" w:lineRule="auto" w:before="0" w:after="360"/>
+        <w:ind w:firstLine="720"/>
         <w:jc w:val="both"/>
       </w:pPr>
       <w:r>
@@ -1632,6 +1835,7 @@
     <w:p>
       <w:pPr>
         <w:pStyle w:val="Heading1"/>
+        <w:keepNext/>
         <w:pageBreakBefore/>
       </w:pPr>
       <w:r>
@@ -1641,6 +1845,8 @@
     <w:p>
       <w:pPr>
         <w:pStyle w:val="Heading2"/>
+        <w:keepNext/>
+        <w:spacing w:after="360"/>
       </w:pPr>
       <w:r>
         <w:t>4.1 主要任务与验证</w:t>
@@ -1649,15 +1855,23 @@
     <w:p>
       <w:pPr>
         <w:widowControl/>
+        <w:spacing w:line="360" w:lineRule="auto" w:after="360"/>
+        <w:ind w:firstLine="0"/>
         <w:jc w:val="both"/>
       </w:pPr>
       <w:r>
+        <w:rPr>
+          <w:rFonts w:ascii="Times New Roman" w:hAnsi="Times New Roman" w:eastAsia="SimSun"/>
+          <w:sz w:val="24"/>
+        </w:rPr>
         <w:t>项目工作涵盖需求、流程与数据设计、初步网页原型及客户测试准备。试运行应检查二维码对应商品、库存加减、照片读取、指定标签打印及管理员记录更正。仅能打开页面不足以证明这些功能正确。</w:t>
       </w:r>
     </w:p>
     <w:p>
       <w:pPr>
         <w:pStyle w:val="Heading2"/>
+        <w:keepNext/>
+        <w:spacing w:after="360"/>
       </w:pPr>
       <w:r>
         <w:t>4.2 数据责任与学习</w:t>
@@ -1666,17 +1880,30 @@
     <w:p>
       <w:pPr>
         <w:widowControl/>
+        <w:spacing w:line="360" w:lineRule="auto" w:after="360"/>
+        <w:ind w:firstLine="0"/>
         <w:jc w:val="both"/>
       </w:pPr>
       <w:r>
+        <w:rPr>
+          <w:rFonts w:ascii="Times New Roman" w:hAnsi="Times New Roman" w:eastAsia="SimSun"/>
+          <w:sz w:val="24"/>
+        </w:rPr>
         <w:t>正式使用前须核实期初库存，清楚标识测试记录，并在更正时保留核查资料。密码与私人照片链接不应公开。项目促进软件设计及工具应用能力（CO1–CO2）、沟通与自主学习（CO5–CO7），以及负责任地处理客户资料（CO3–CO4）。</w:t>
       </w:r>
     </w:p>
     <w:p>
       <w:pPr>
+        <w:widowControl/>
+        <w:spacing w:line="360" w:lineRule="auto" w:after="360"/>
+        <w:ind w:firstLine="720"/>
         <w:jc w:val="both"/>
       </w:pPr>
       <w:r>
+        <w:rPr>
+          <w:rFonts w:ascii="Times New Roman" w:hAnsi="Times New Roman" w:eastAsia="SimSun"/>
+          <w:sz w:val="24"/>
+        </w:rPr>
         <w:t>本阶段的主要困难是把日常操作描述转化为明确规则，例如数量使用哪个单位、哪些信息需要隐藏、记录填错后如何更正。我以分类需求、分开工人与管理员流程，以及明确数据字段的方式处理。这加强了沟通、独立研究和问题拆解能力；客户意见尚待收集，因此不虚构具体修改结果。</w:t>
       </w:r>
     </w:p>
@@ -1688,6 +1915,7 @@
     <w:p>
       <w:pPr>
         <w:pStyle w:val="Heading1"/>
+        <w:keepNext/>
       </w:pPr>
       <w:r>
         <w:t>第五章——阶段总结</w:t>
@@ -1696,6 +1924,8 @@
     <w:p>
       <w:pPr>
         <w:pStyle w:val="Heading2"/>
+        <w:keepNext/>
+        <w:spacing w:after="360"/>
       </w:pPr>
       <w:r>
         <w:t>5.1 当前状态与后续工作</w:t>
@@ -1704,9 +1934,15 @@
     <w:p>
       <w:pPr>
         <w:widowControl/>
+        <w:spacing w:line="360" w:lineRule="auto" w:after="360"/>
+        <w:ind w:firstLine="0"/>
         <w:jc w:val="both"/>
       </w:pPr>
       <w:r>
+        <w:rPr>
+          <w:rFonts w:ascii="Times New Roman" w:hAnsi="Times New Roman" w:eastAsia="SimSun"/>
+          <w:sz w:val="24"/>
+        </w:rPr>
         <w:t>第一、二周通过客户沟通、需求分析、技术研究与初步开发，建立了二维码库存网站的原型，目前待客户检视。实际反馈、修改与维护将在取得资料后另外记录。本部分仅涵盖前两周，作为较长实习报告的开端。</w:t>
       </w:r>
     </w:p>
@@ -1718,6 +1954,63 @@
     <w:p>
       <w:pPr>
         <w:pStyle w:val="Heading1"/>
+      </w:pPr>
+      <w:r>
+        <w:t>参考资料</w:t>
+      </w:r>
+    </w:p>
+    <w:p>
+      <w:pPr>
+        <w:spacing w:line="360" w:lineRule="auto" w:after="240"/>
+      </w:pPr>
+      <w:r>
+        <w:t>Bakti Makmur (M) Sdn. Bhd. (2026) Internship offer letter to Wong Sook En, 15 September. Unpublished document; company details only.</w:t>
+      </w:r>
+    </w:p>
+    <w:p>
+      <w:pPr>
+        <w:spacing w:line="360" w:lineRule="auto" w:after="240"/>
+      </w:pPr>
+      <w:r>
+        <w:t>Universiti Tunku Abdul Rahman (2026) Industrial Training Plan: Wong Sook En, FM-FES-ITC-004, revision 4, 13 October. Unpublished training document.</w:t>
+      </w:r>
+    </w:p>
+    <w:p>
+      <w:pPr>
+        <w:spacing w:line="360" w:lineRule="auto" w:after="240"/>
+      </w:pPr>
+      <w:r>
+        <w:t>Universiti Tunku Abdul Rahman (2024a) Industrial Training Report Guidelines (Engineering, Architecture and Science), GD-FES-ITC-007, revision 6, effective 1 April.</w:t>
+      </w:r>
+    </w:p>
+    <w:p>
+      <w:pPr>
+        <w:spacing w:line="360" w:lineRule="auto" w:after="240"/>
+      </w:pPr>
+      <w:r>
+        <w:t>Universiti Tunku Abdul Rahman (2024b) GD008 IT Report Template 2024. Report template.</w:t>
+      </w:r>
+    </w:p>
+    <w:p>
+      <w:pPr>
+        <w:spacing w:line="360" w:lineRule="auto" w:after="240"/>
+      </w:pPr>
+      <w:r>
+        <w:t>Google (n.d.) Apps Script documentation. Available at: https://developers.google.com/apps-script/.</w:t>
+      </w:r>
+    </w:p>
+    <w:p>
+      <w:pPr>
+        <w:spacing w:line="360" w:lineRule="auto" w:after="240"/>
+      </w:pPr>
+      <w:r>
+        <w:t>MDN Web Docs (n.d.) Web technology documentation: HTML, CSS and JavaScript. Available at: https://developer.mozilla.org/.</w:t>
+      </w:r>
+    </w:p>
+    <w:p>
+      <w:pPr>
+        <w:pStyle w:val="Heading1"/>
+        <w:pageBreakBefore/>
       </w:pPr>
       <w:r>
         <w:t>附录 A——需求、计划及测试案例</w:t>
@@ -12079,7 +12372,7 @@
     <w:sectPr>
       <w:headerReference w:type="default" r:id="rId17"/>
       <w:footerReference w:type="default" r:id="rId18"/>
-      <w:pgSz w:h="16840" w:w="11910" w:orient="portrait"/>
+      <w:pgSz w:h="16838" w:w="11906" w:orient="portrait"/>
       <w:pgMar w:bottom="1660" w:top="1320" w:left="1080" w:right="500" w:header="0" w:footer="1474"/>
       <w:pgNumType w:fmt="decimal" w:start="1"/>
     </w:sectPr>
@@ -12655,7 +12948,7 @@
     <w:name w:val="Normal"/>
     <w:qFormat w:val="1"/>
     <w:pPr>
-      <w:spacing w:line="360" w:lineRule="auto" w:after="200"/>
+      <w:spacing w:line="360" w:lineRule="auto" w:after="360"/>
     </w:pPr>
     <w:rPr>
       <w:rFonts w:ascii="Times New Roman" w:cs="Arial MT" w:eastAsia="SimSun" w:hAnsi="Times New Roman"/>

</xml_diff>